<commit_message>
read through and edits
</commit_message>
<xml_diff>
--- a/docs/Proposal.docx
+++ b/docs/Proposal.docx
@@ -368,7 +368,19 @@
         <w:rPr>
           <w:rFonts w:ascii="Georgia" w:hAnsi="Georgia"/>
         </w:rPr>
-        <w:t>would give us insights into where they target forage fish</w:t>
+        <w:t xml:space="preserve">would give us insights into where </w:t>
+      </w:r>
+      <w:r>
+        <w:rPr>
+          <w:rFonts w:ascii="Georgia" w:hAnsi="Georgia"/>
+        </w:rPr>
+        <w:t xml:space="preserve">and when </w:t>
+      </w:r>
+      <w:r>
+        <w:rPr>
+          <w:rFonts w:ascii="Georgia" w:hAnsi="Georgia"/>
+        </w:rPr>
+        <w:t>they target forage fish</w:t>
       </w:r>
       <w:r>
         <w:rPr>
@@ -705,7 +717,19 @@
         <w:rPr>
           <w:rFonts w:ascii="Georgia" w:hAnsi="Georgia"/>
         </w:rPr>
-        <w:t>that only measure a portion of the state each. For</w:t>
+        <w:t xml:space="preserve">that </w:t>
+      </w:r>
+      <w:r>
+        <w:rPr>
+          <w:rFonts w:ascii="Georgia" w:hAnsi="Georgia"/>
+        </w:rPr>
+        <w:t xml:space="preserve">each </w:t>
+      </w:r>
+      <w:r>
+        <w:rPr>
+          <w:rFonts w:ascii="Georgia" w:hAnsi="Georgia"/>
+        </w:rPr>
+        <w:t>only measure a portion of the state. For</w:t>
       </w:r>
       <w:r>
         <w:rPr>
@@ -749,7 +773,7 @@
           <w:rFonts w:ascii="Georgia" w:hAnsi="Georgia"/>
         </w:rPr>
         <w:lastRenderedPageBreak/>
-        <w:t xml:space="preserve">Three key problems would </w:t>
+        <w:t xml:space="preserve">Three key problems </w:t>
       </w:r>
       <w:r>
         <w:rPr>
@@ -912,25 +936,13 @@
         <w:rPr>
           <w:rFonts w:ascii="Georgia" w:hAnsi="Georgia"/>
         </w:rPr>
-        <w:t>identify the toolkit needed to enable on-tag sensor fusion as this information will inform the</w:t>
-      </w:r>
-      <w:r>
-        <w:rPr>
-          <w:rFonts w:ascii="Georgia" w:hAnsi="Georgia"/>
-        </w:rPr>
-        <w:t xml:space="preserve"> feasibility of </w:t>
-      </w:r>
-      <w:r>
-        <w:rPr>
-          <w:rFonts w:ascii="Georgia" w:hAnsi="Georgia"/>
-        </w:rPr>
-        <w:t xml:space="preserve">behavior monitoring through </w:t>
-      </w:r>
-      <w:r>
-        <w:rPr>
-          <w:rFonts w:ascii="Georgia" w:hAnsi="Georgia"/>
-        </w:rPr>
-        <w:t>sensor fusion</w:t>
+        <w:t>identify the toolkit needed to enable on-tag sensor fusion</w:t>
+      </w:r>
+      <w:r>
+        <w:rPr>
+          <w:rFonts w:ascii="Georgia" w:hAnsi="Georgia"/>
+        </w:rPr>
+        <w:t xml:space="preserve"> capable of behavior identification</w:t>
       </w:r>
       <w:r>
         <w:rPr>
@@ -938,6 +950,13 @@
         </w:rPr>
         <w:t>.</w:t>
       </w:r>
+    </w:p>
+    <w:p>
+      <w:pPr>
+        <w:rPr>
+          <w:rFonts w:ascii="Georgia" w:hAnsi="Georgia"/>
+        </w:rPr>
+      </w:pPr>
     </w:p>
     <w:p>
       <w:pPr>
@@ -957,94 +976,17 @@
           <w:sz w:val="36"/>
           <w:szCs w:val="36"/>
         </w:rPr>
-        <w:t>Goals</w:t>
-      </w:r>
-    </w:p>
-    <w:p>
-      <w:pPr>
-        <w:rPr>
-          <w:rFonts w:ascii="Georgia" w:hAnsi="Georgia"/>
-        </w:rPr>
-      </w:pPr>
-      <w:r>
+        <w:br w:type="page"/>
+      </w:r>
+    </w:p>
+    <w:p>
+      <w:pPr>
         <w:rPr>
           <w:rFonts w:ascii="Georgia" w:hAnsi="Georgia"/>
           <w:b/>
           <w:bCs/>
-        </w:rPr>
-        <w:t>G1:</w:t>
-      </w:r>
-      <w:r>
-        <w:rPr>
-          <w:rFonts w:ascii="Georgia" w:hAnsi="Georgia"/>
-        </w:rPr>
-        <w:t xml:space="preserve"> To provide sensor and filter specification</w:t>
-      </w:r>
-      <w:r>
-        <w:rPr>
-          <w:rFonts w:ascii="Georgia" w:hAnsi="Georgia"/>
-        </w:rPr>
-        <w:t>s</w:t>
-      </w:r>
-      <w:r>
-        <w:rPr>
-          <w:rFonts w:ascii="Georgia" w:hAnsi="Georgia"/>
-        </w:rPr>
-        <w:t xml:space="preserve"> </w:t>
-      </w:r>
-      <w:r>
-        <w:rPr>
-          <w:rFonts w:ascii="Georgia" w:hAnsi="Georgia"/>
-        </w:rPr>
-        <w:t xml:space="preserve">that would capture </w:t>
-      </w:r>
-      <w:r>
-        <w:rPr>
-          <w:rFonts w:ascii="Georgia" w:hAnsi="Georgia"/>
-        </w:rPr>
-        <w:t>tag trajector</w:t>
-      </w:r>
-      <w:r>
-        <w:rPr>
-          <w:rFonts w:ascii="Georgia" w:hAnsi="Georgia"/>
-        </w:rPr>
-        <w:t>ies</w:t>
-      </w:r>
-      <w:r>
-        <w:rPr>
-          <w:rFonts w:ascii="Georgia" w:hAnsi="Georgia"/>
-        </w:rPr>
-        <w:t xml:space="preserve"> during </w:t>
-      </w:r>
-      <w:r>
-        <w:rPr>
-          <w:rFonts w:ascii="Georgia" w:hAnsi="Georgia"/>
-        </w:rPr>
-        <w:t xml:space="preserve">interesting </w:t>
-      </w:r>
-      <w:r>
-        <w:rPr>
-          <w:rFonts w:ascii="Georgia" w:hAnsi="Georgia"/>
-        </w:rPr>
-        <w:t xml:space="preserve">behaviors </w:t>
-      </w:r>
-      <w:r>
-        <w:rPr>
-          <w:rFonts w:ascii="Georgia" w:hAnsi="Georgia"/>
-        </w:rPr>
-        <w:t>for a species of fish, shark, and cetacean</w:t>
-      </w:r>
-      <w:r>
-        <w:rPr>
-          <w:rFonts w:ascii="Georgia" w:hAnsi="Georgia"/>
-        </w:rPr>
-        <w:t xml:space="preserve">. </w:t>
-      </w:r>
-    </w:p>
-    <w:p>
-      <w:pPr>
-        <w:rPr>
-          <w:rFonts w:ascii="Georgia" w:hAnsi="Georgia"/>
+          <w:sz w:val="36"/>
+          <w:szCs w:val="36"/>
         </w:rPr>
       </w:pPr>
       <w:r>
@@ -1052,28 +994,157 @@
           <w:rFonts w:ascii="Georgia" w:hAnsi="Georgia"/>
           <w:b/>
           <w:bCs/>
-        </w:rPr>
-        <w:t>G2:</w:t>
-      </w:r>
-      <w:r>
-        <w:rPr>
-          <w:rFonts w:ascii="Georgia" w:hAnsi="Georgia"/>
-        </w:rPr>
-        <w:t xml:space="preserve"> To make </w:t>
-      </w:r>
-      <w:r>
-        <w:rPr>
-          <w:rFonts w:ascii="Georgia" w:hAnsi="Georgia"/>
-        </w:rPr>
-        <w:t xml:space="preserve">the tooling required to answer </w:t>
-      </w:r>
+          <w:sz w:val="36"/>
+          <w:szCs w:val="36"/>
+        </w:rPr>
+        <w:lastRenderedPageBreak/>
+        <w:t>Goals</w:t>
+      </w:r>
+    </w:p>
+    <w:p>
+      <w:pPr>
+        <w:rPr>
+          <w:rFonts w:ascii="Georgia" w:hAnsi="Georgia"/>
+        </w:rPr>
+      </w:pPr>
       <w:r>
         <w:rPr>
           <w:rFonts w:ascii="Georgia" w:hAnsi="Georgia"/>
           <w:b/>
           <w:bCs/>
         </w:rPr>
-        <w:t xml:space="preserve">G1 </w:t>
+        <w:t>G1:</w:t>
+      </w:r>
+      <w:r>
+        <w:rPr>
+          <w:rFonts w:ascii="Georgia" w:hAnsi="Georgia"/>
+        </w:rPr>
+        <w:t xml:space="preserve"> To provide sensor and filter specification</w:t>
+      </w:r>
+      <w:r>
+        <w:rPr>
+          <w:rFonts w:ascii="Georgia" w:hAnsi="Georgia"/>
+        </w:rPr>
+        <w:t>s</w:t>
+      </w:r>
+      <w:r>
+        <w:rPr>
+          <w:rFonts w:ascii="Georgia" w:hAnsi="Georgia"/>
+        </w:rPr>
+        <w:t xml:space="preserve"> </w:t>
+      </w:r>
+      <w:r>
+        <w:rPr>
+          <w:rFonts w:ascii="Georgia" w:hAnsi="Georgia"/>
+        </w:rPr>
+        <w:t xml:space="preserve">that would capture </w:t>
+      </w:r>
+      <w:r>
+        <w:rPr>
+          <w:rFonts w:ascii="Georgia" w:hAnsi="Georgia"/>
+        </w:rPr>
+        <w:t>tag trajector</w:t>
+      </w:r>
+      <w:r>
+        <w:rPr>
+          <w:rFonts w:ascii="Georgia" w:hAnsi="Georgia"/>
+        </w:rPr>
+        <w:t>ies</w:t>
+      </w:r>
+      <w:r>
+        <w:rPr>
+          <w:rFonts w:ascii="Georgia" w:hAnsi="Georgia"/>
+        </w:rPr>
+        <w:t xml:space="preserve"> during </w:t>
+      </w:r>
+      <w:r>
+        <w:rPr>
+          <w:rFonts w:ascii="Georgia" w:hAnsi="Georgia"/>
+        </w:rPr>
+        <w:t xml:space="preserve">interesting </w:t>
+      </w:r>
+      <w:r>
+        <w:rPr>
+          <w:rFonts w:ascii="Georgia" w:hAnsi="Georgia"/>
+        </w:rPr>
+        <w:t xml:space="preserve">behaviors </w:t>
+      </w:r>
+      <w:r>
+        <w:rPr>
+          <w:rFonts w:ascii="Georgia" w:hAnsi="Georgia"/>
+        </w:rPr>
+        <w:t xml:space="preserve">for a species of </w:t>
+      </w:r>
+      <w:r>
+        <w:rPr>
+          <w:rFonts w:ascii="Georgia" w:hAnsi="Georgia"/>
+        </w:rPr>
+        <w:t>teleost</w:t>
+      </w:r>
+      <w:r>
+        <w:rPr>
+          <w:rFonts w:ascii="Georgia" w:hAnsi="Georgia"/>
+        </w:rPr>
+        <w:t xml:space="preserve">, </w:t>
+      </w:r>
+      <w:r>
+        <w:rPr>
+          <w:rFonts w:ascii="Georgia" w:hAnsi="Georgia"/>
+        </w:rPr>
+        <w:t>chondrichthyan</w:t>
+      </w:r>
+      <w:r>
+        <w:rPr>
+          <w:rFonts w:ascii="Georgia" w:hAnsi="Georgia"/>
+        </w:rPr>
+        <w:t>, and cetacean</w:t>
+      </w:r>
+      <w:r>
+        <w:rPr>
+          <w:rFonts w:ascii="Georgia" w:hAnsi="Georgia"/>
+        </w:rPr>
+        <w:t xml:space="preserve">. </w:t>
+      </w:r>
+    </w:p>
+    <w:p>
+      <w:pPr>
+        <w:rPr>
+          <w:rFonts w:ascii="Georgia" w:hAnsi="Georgia"/>
+        </w:rPr>
+      </w:pPr>
+      <w:r>
+        <w:rPr>
+          <w:rFonts w:ascii="Georgia" w:hAnsi="Georgia"/>
+          <w:b/>
+          <w:bCs/>
+        </w:rPr>
+        <w:t>G2:</w:t>
+      </w:r>
+      <w:r>
+        <w:rPr>
+          <w:rFonts w:ascii="Georgia" w:hAnsi="Georgia"/>
+        </w:rPr>
+        <w:t xml:space="preserve"> To make </w:t>
+      </w:r>
+      <w:r>
+        <w:rPr>
+          <w:rFonts w:ascii="Georgia" w:hAnsi="Georgia"/>
+        </w:rPr>
+        <w:t xml:space="preserve">the tooling required to answer </w:t>
+      </w:r>
+      <w:r>
+        <w:rPr>
+          <w:rFonts w:ascii="Georgia" w:hAnsi="Georgia"/>
+        </w:rPr>
+        <w:t>G1</w:t>
+      </w:r>
+      <w:r>
+        <w:rPr>
+          <w:rFonts w:ascii="Georgia" w:hAnsi="Georgia"/>
+          <w:b/>
+          <w:bCs/>
+        </w:rPr>
+        <w:t xml:space="preserve"> </w:t>
       </w:r>
       <w:r>
         <w:rPr>
@@ -1143,7 +1214,7 @@
         <w:rPr>
           <w:rFonts w:ascii="Georgia" w:hAnsi="Georgia"/>
         </w:rPr>
-        <w:t>Registry entries for each species.</w:t>
+        <w:t>Recommendations for each species.</w:t>
       </w:r>
     </w:p>
     <w:p>
@@ -1161,7 +1232,37 @@
         <w:rPr>
           <w:rFonts w:ascii="Georgia" w:hAnsi="Georgia"/>
         </w:rPr>
-        <w:t>Recommendations for each species.</w:t>
+        <w:t xml:space="preserve">Anticipated issues and sensitivities </w:t>
+      </w:r>
+      <w:r>
+        <w:rPr>
+          <w:rFonts w:ascii="Georgia" w:hAnsi="Georgia"/>
+        </w:rPr>
+        <w:t>accompanying</w:t>
+      </w:r>
+      <w:r>
+        <w:rPr>
+          <w:rFonts w:ascii="Georgia" w:hAnsi="Georgia"/>
+        </w:rPr>
+        <w:t xml:space="preserve"> each the recommendations.</w:t>
+      </w:r>
+    </w:p>
+    <w:p>
+      <w:pPr>
+        <w:pStyle w:val="ListParagraph"/>
+        <w:numPr>
+          <w:ilvl w:val="0"/>
+          <w:numId w:val="5"/>
+        </w:numPr>
+        <w:rPr>
+          <w:rFonts w:ascii="Georgia" w:hAnsi="Georgia"/>
+        </w:rPr>
+      </w:pPr>
+      <w:r>
+        <w:rPr>
+          <w:rFonts w:ascii="Georgia" w:hAnsi="Georgia"/>
+        </w:rPr>
+        <w:t>A GitHub repository containing:</w:t>
       </w:r>
     </w:p>
     <w:p>
@@ -1179,25 +1280,7 @@
         <w:rPr>
           <w:rFonts w:ascii="Georgia" w:hAnsi="Georgia"/>
         </w:rPr>
-        <w:t>Anticipated issues and sensitivities of each the recommendations.</w:t>
-      </w:r>
-    </w:p>
-    <w:p>
-      <w:pPr>
-        <w:pStyle w:val="ListParagraph"/>
-        <w:numPr>
-          <w:ilvl w:val="0"/>
-          <w:numId w:val="5"/>
-        </w:numPr>
-        <w:rPr>
-          <w:rFonts w:ascii="Georgia" w:hAnsi="Georgia"/>
-        </w:rPr>
-      </w:pPr>
-      <w:r>
-        <w:rPr>
-          <w:rFonts w:ascii="Georgia" w:hAnsi="Georgia"/>
-        </w:rPr>
-        <w:t>A GitHub repository containing:</w:t>
+        <w:t>Toolkit code</w:t>
       </w:r>
     </w:p>
     <w:p>
@@ -1215,7 +1298,7 @@
         <w:rPr>
           <w:rFonts w:ascii="Georgia" w:hAnsi="Georgia"/>
         </w:rPr>
-        <w:t>Simulation application code</w:t>
+        <w:t>A container or other means of quickly and efficiently running both</w:t>
       </w:r>
     </w:p>
     <w:p>
@@ -1233,42 +1316,6 @@
         <w:rPr>
           <w:rFonts w:ascii="Georgia" w:hAnsi="Georgia"/>
         </w:rPr>
-        <w:t>Inspector application code</w:t>
-      </w:r>
-    </w:p>
-    <w:p>
-      <w:pPr>
-        <w:pStyle w:val="ListParagraph"/>
-        <w:numPr>
-          <w:ilvl w:val="1"/>
-          <w:numId w:val="5"/>
-        </w:numPr>
-        <w:rPr>
-          <w:rFonts w:ascii="Georgia" w:hAnsi="Georgia"/>
-        </w:rPr>
-      </w:pPr>
-      <w:r>
-        <w:rPr>
-          <w:rFonts w:ascii="Georgia" w:hAnsi="Georgia"/>
-        </w:rPr>
-        <w:t>A container or other means of quickly and efficiently running both</w:t>
-      </w:r>
-    </w:p>
-    <w:p>
-      <w:pPr>
-        <w:pStyle w:val="ListParagraph"/>
-        <w:numPr>
-          <w:ilvl w:val="1"/>
-          <w:numId w:val="5"/>
-        </w:numPr>
-        <w:rPr>
-          <w:rFonts w:ascii="Georgia" w:hAnsi="Georgia"/>
-        </w:rPr>
-      </w:pPr>
-      <w:r>
-        <w:rPr>
-          <w:rFonts w:ascii="Georgia" w:hAnsi="Georgia"/>
-        </w:rPr>
         <w:t xml:space="preserve">Technical documentation including a user guide, design documents, and guidance on adding to the registries </w:t>
       </w:r>
     </w:p>
@@ -1297,6 +1344,28 @@
           <w:sz w:val="36"/>
           <w:szCs w:val="36"/>
         </w:rPr>
+        <w:br w:type="page"/>
+      </w:r>
+    </w:p>
+    <w:p>
+      <w:pPr>
+        <w:rPr>
+          <w:rFonts w:ascii="Georgia" w:hAnsi="Georgia"/>
+          <w:b/>
+          <w:bCs/>
+          <w:sz w:val="36"/>
+          <w:szCs w:val="36"/>
+        </w:rPr>
+      </w:pPr>
+      <w:r>
+        <w:rPr>
+          <w:rFonts w:ascii="Georgia" w:hAnsi="Georgia"/>
+          <w:b/>
+          <w:bCs/>
+          <w:sz w:val="36"/>
+          <w:szCs w:val="36"/>
+        </w:rPr>
+        <w:lastRenderedPageBreak/>
         <w:t>Methods</w:t>
       </w:r>
     </w:p>
@@ -1332,7 +1401,6 @@
           <w:rFonts w:ascii="Georgia" w:hAnsi="Georgia"/>
           <w:noProof/>
         </w:rPr>
-        <w:lastRenderedPageBreak/>
         <w:drawing>
           <wp:inline distT="0" distB="0" distL="0" distR="0" wp14:anchorId="27541BC7" wp14:editId="75AF7601">
             <wp:extent cx="5943600" cy="3260090"/>
@@ -1385,8 +1453,55 @@
       <w:r>
         <w:rPr>
           <w:rFonts w:ascii="Georgia" w:hAnsi="Georgia"/>
-        </w:rPr>
-        <w:t xml:space="preserve">To identify feasible solutions, we will use an iterative approach. Broadly, sensor fusion proceeds by iteratively taking an estimate of state, projecting it forward in time using a process model, and then reweighting the resulting distribution </w:t>
+          <w:b/>
+          <w:bCs/>
+        </w:rPr>
+        <w:t>Figure 1:</w:t>
+      </w:r>
+      <w:r>
+        <w:rPr>
+          <w:rFonts w:ascii="Georgia" w:hAnsi="Georgia"/>
+        </w:rPr>
+        <w:t xml:space="preserve"> </w:t>
+      </w:r>
+      <w:r>
+        <w:rPr>
+          <w:rFonts w:ascii="Georgia" w:hAnsi="Georgia"/>
+          <w:i/>
+          <w:iCs/>
+        </w:rPr>
+        <w:t>Illustration of an iterative approach to sensor fusion design.</w:t>
+      </w:r>
+      <w:r>
+        <w:rPr>
+          <w:rFonts w:ascii="Georgia" w:hAnsi="Georgia"/>
+        </w:rPr>
+        <w:t xml:space="preserve"> </w:t>
+      </w:r>
+    </w:p>
+    <w:p>
+      <w:pPr>
+        <w:rPr>
+          <w:rFonts w:ascii="Georgia" w:hAnsi="Georgia"/>
+        </w:rPr>
+      </w:pPr>
+      <w:r>
+        <w:rPr>
+          <w:rFonts w:ascii="Georgia" w:hAnsi="Georgia"/>
+        </w:rPr>
+        <w:t>To identify feasible solutions, we will use an iterative approach</w:t>
+      </w:r>
+      <w:r>
+        <w:rPr>
+          <w:rFonts w:ascii="Georgia" w:hAnsi="Georgia"/>
+        </w:rPr>
+        <w:t xml:space="preserve"> (Figure 1)</w:t>
+      </w:r>
+      <w:r>
+        <w:rPr>
+          <w:rFonts w:ascii="Georgia" w:hAnsi="Georgia"/>
+        </w:rPr>
+        <w:t xml:space="preserve">. Broadly, sensor fusion proceeds by iteratively taking an estimate of state, projecting it forward in time using a process model, and then reweighting the resulting distribution </w:t>
       </w:r>
       <w:r>
         <w:rPr>
@@ -1398,7 +1513,19 @@
         <w:rPr>
           <w:rFonts w:ascii="Georgia" w:hAnsi="Georgia"/>
         </w:rPr>
-        <w:t xml:space="preserve"> how likely the observed measurements at each proposed state. </w:t>
+        <w:t xml:space="preserve"> how likely the observed measurements </w:t>
+      </w:r>
+      <w:r>
+        <w:rPr>
+          <w:rFonts w:ascii="Georgia" w:hAnsi="Georgia"/>
+        </w:rPr>
+        <w:t xml:space="preserve">are </w:t>
+      </w:r>
+      <w:r>
+        <w:rPr>
+          <w:rFonts w:ascii="Georgia" w:hAnsi="Georgia"/>
+        </w:rPr>
+        <w:t xml:space="preserve">at each proposed state. </w:t>
       </w:r>
       <w:r>
         <w:rPr>
@@ -1416,21 +1543,82 @@
         <w:rPr>
           <w:rFonts w:ascii="Georgia" w:hAnsi="Georgia"/>
         </w:rPr>
-        <w:t xml:space="preserve"> if one begins with an arbitrary proposed solution and finds the process model diverges away from the actual state it is clear the process model needs adjustment. If on the other hand the measurement weights do not provide tight enough constraints on the state distribution it becomes clear that better or different sensors are needed. Which can be determined by how the state diverges over time. In this way comparing the actual state, proposed state, and measurement weights for one solution will recommend another and this process can be repeated until a useful solution is reached. </w:t>
-      </w:r>
-    </w:p>
-    <w:p>
-      <w:pPr>
-        <w:rPr>
-          <w:rFonts w:ascii="Georgia" w:hAnsi="Georgia"/>
-        </w:rPr>
-      </w:pPr>
-      <w:r>
-        <w:rPr>
-          <w:rFonts w:ascii="Georgia" w:hAnsi="Georgia"/>
-        </w:rPr>
-        <w:t xml:space="preserve">Producing the required results for a specific solution requires a multistage simulation. First animal movement must be simulated. Next, as the tag is in its own frame, the deviation from animal movement must be simulated as well. After this sensor measurements and their corresponding error must be simulated at which point </w:t>
-      </w:r>
+        <w:t xml:space="preserve"> if one begins with an arbitrary proposed solution and finds the process model diverges away from the actual state it is clear the process model needs adjustment. If on the other hand the measurement weights do not provide tight enough constraints on the state distribution it becomes clear that better or different sensors are needed. Which</w:t>
+      </w:r>
+      <w:r>
+        <w:rPr>
+          <w:rFonts w:ascii="Georgia" w:hAnsi="Georgia"/>
+        </w:rPr>
+        <w:t xml:space="preserve"> is the case</w:t>
+      </w:r>
+      <w:r>
+        <w:rPr>
+          <w:rFonts w:ascii="Georgia" w:hAnsi="Georgia"/>
+        </w:rPr>
+        <w:t xml:space="preserve"> can be determined by how the state diverges over time. In this way comparing the actual state, proposed state, and measurement weights for one solution will recommend another and this process can be repeated until a useful solution is reached. </w:t>
+      </w:r>
+    </w:p>
+    <w:p>
+      <w:pPr>
+        <w:rPr>
+          <w:rFonts w:ascii="Georgia" w:hAnsi="Georgia"/>
+        </w:rPr>
+      </w:pPr>
+      <w:r>
+        <w:rPr>
+          <w:rFonts w:ascii="Georgia" w:hAnsi="Georgia"/>
+        </w:rPr>
+        <w:t>Producing the required results for a specific solution requires a multistage simulation. First</w:t>
+      </w:r>
+      <w:r>
+        <w:rPr>
+          <w:rFonts w:ascii="Georgia" w:hAnsi="Georgia"/>
+        </w:rPr>
+        <w:t>,</w:t>
+      </w:r>
+      <w:r>
+        <w:rPr>
+          <w:rFonts w:ascii="Georgia" w:hAnsi="Georgia"/>
+        </w:rPr>
+        <w:t xml:space="preserve"> animal movement must be simulated. Next, as the tag is in its own frame, the deviation from animal movement must be simulated as well. After this</w:t>
+      </w:r>
+      <w:r>
+        <w:rPr>
+          <w:rFonts w:ascii="Georgia" w:hAnsi="Georgia"/>
+        </w:rPr>
+        <w:t>,</w:t>
+      </w:r>
+      <w:r>
+        <w:rPr>
+          <w:rFonts w:ascii="Georgia" w:hAnsi="Georgia"/>
+        </w:rPr>
+        <w:t xml:space="preserve"> sensor measurements and their corresponding error must be simulated</w:t>
+      </w:r>
+      <w:r>
+        <w:rPr>
+          <w:rFonts w:ascii="Georgia" w:hAnsi="Georgia"/>
+        </w:rPr>
+        <w:t>.</w:t>
+      </w:r>
+      <w:r>
+        <w:rPr>
+          <w:rFonts w:ascii="Georgia" w:hAnsi="Georgia"/>
+        </w:rPr>
+        <w:t xml:space="preserve"> </w:t>
+      </w:r>
+      <w:r>
+        <w:rPr>
+          <w:rFonts w:ascii="Georgia" w:hAnsi="Georgia"/>
+        </w:rPr>
+        <w:t>At this</w:t>
+      </w:r>
+      <w:r>
+        <w:rPr>
+          <w:rFonts w:ascii="Georgia" w:hAnsi="Georgia"/>
+        </w:rPr>
+        <w:t xml:space="preserve"> point </w:t>
+      </w:r>
+      <w:proofErr w:type="gramStart"/>
       <w:r>
         <w:rPr>
           <w:rFonts w:ascii="Georgia" w:hAnsi="Georgia"/>
@@ -1441,7 +1629,26 @@
         <w:rPr>
           <w:rFonts w:ascii="Georgia" w:hAnsi="Georgia"/>
         </w:rPr>
-        <w:t xml:space="preserve"> the information required to try a specific filter algorithm is available. The filter must then be used, its resulting distributions </w:t>
+        <w:t xml:space="preserve"> </w:t>
+      </w:r>
+      <w:r>
+        <w:rPr>
+          <w:rFonts w:ascii="Georgia" w:hAnsi="Georgia"/>
+        </w:rPr>
+        <w:t>of</w:t>
+      </w:r>
+      <w:proofErr w:type="gramEnd"/>
+      <w:r>
+        <w:rPr>
+          <w:rFonts w:ascii="Georgia" w:hAnsi="Georgia"/>
+        </w:rPr>
+        <w:t xml:space="preserve"> </w:t>
+      </w:r>
+      <w:r>
+        <w:rPr>
+          <w:rFonts w:ascii="Georgia" w:hAnsi="Georgia"/>
+        </w:rPr>
+        <w:t xml:space="preserve">the information required to try a specific filter algorithm is available. The filter must then be used, its resulting distributions </w:t>
       </w:r>
       <w:r>
         <w:rPr>
@@ -1466,45 +1673,147 @@
         <w:rPr>
           <w:rFonts w:ascii="Georgia" w:hAnsi="Georgia"/>
         </w:rPr>
-        <w:t>Given</w:t>
-      </w:r>
-      <w:r>
-        <w:rPr>
-          <w:rFonts w:ascii="Georgia" w:hAnsi="Georgia"/>
-        </w:rPr>
-        <w:t xml:space="preserve"> the large variety of potential behavior models, tag models, sensors, and process and observation models, it seems prudent to associate each with a registry. The registry will define the necessary contract for each registered model, capture and expose each addition to the user, and provide a means for the simulation module to pull the requested model. The simulation module will then configure the model as requested, </w:t>
-      </w:r>
-      <w:r>
-        <w:rPr>
-          <w:rFonts w:ascii="Georgia" w:hAnsi="Georgia"/>
-        </w:rPr>
         <w:lastRenderedPageBreak/>
-        <w:t>run the model on the specified data, and then provide regularized outputs for the stage in question. In so doing we will enable the addition of new models to the framework without the overhead of a full codebase contribution.</w:t>
-      </w:r>
-    </w:p>
-    <w:p>
-      <w:pPr>
-        <w:rPr>
-          <w:rFonts w:ascii="Georgia" w:hAnsi="Georgia"/>
-        </w:rPr>
-      </w:pPr>
-      <w:r>
-        <w:rPr>
-          <w:rFonts w:ascii="Georgia" w:hAnsi="Georgia"/>
-        </w:rPr>
-        <w:t xml:space="preserve">Furthermore, to save computation time and resources components will be built so that </w:t>
-      </w:r>
-      <w:r>
-        <w:rPr>
-          <w:rFonts w:ascii="Georgia" w:hAnsi="Georgia"/>
-        </w:rPr>
-        <w:t xml:space="preserve">each stage is largely reusable by the stages that come after it. Rigid body movement data can be used with a large set of different tag models, the data from any of those of tag model simulation runs can be used with a variety of sensor models, and so on. </w:t>
-      </w:r>
-      <w:r>
-        <w:rPr>
-          <w:rFonts w:ascii="Georgia" w:hAnsi="Georgia"/>
-        </w:rPr>
-        <w:t>Rerunning each of these unnecessarily would simply be a waste of resources.</w:t>
+        <w:t xml:space="preserve">Given the large variety of potential behavior models, tag models, sensors, and process and observation models, it </w:t>
+      </w:r>
+      <w:r>
+        <w:rPr>
+          <w:rFonts w:ascii="Georgia" w:hAnsi="Georgia"/>
+        </w:rPr>
+        <w:t>will be</w:t>
+      </w:r>
+      <w:r>
+        <w:rPr>
+          <w:rFonts w:ascii="Georgia" w:hAnsi="Georgia"/>
+        </w:rPr>
+        <w:t xml:space="preserve"> prudent to associate each with a registry. The registr</w:t>
+      </w:r>
+      <w:r>
+        <w:rPr>
+          <w:rFonts w:ascii="Georgia" w:hAnsi="Georgia"/>
+        </w:rPr>
+        <w:t>ies</w:t>
+      </w:r>
+      <w:r>
+        <w:rPr>
+          <w:rFonts w:ascii="Georgia" w:hAnsi="Georgia"/>
+        </w:rPr>
+        <w:t xml:space="preserve"> will define the necessary contract for each registered model, capture and expose each </w:t>
+      </w:r>
+      <w:r>
+        <w:rPr>
+          <w:rFonts w:ascii="Georgia" w:hAnsi="Georgia"/>
+        </w:rPr>
+        <w:t>model</w:t>
+      </w:r>
+      <w:r>
+        <w:rPr>
+          <w:rFonts w:ascii="Georgia" w:hAnsi="Georgia"/>
+        </w:rPr>
+        <w:t xml:space="preserve"> to the user, and provide a means for the simulation module to pull</w:t>
+      </w:r>
+      <w:r>
+        <w:rPr>
+          <w:rFonts w:ascii="Georgia" w:hAnsi="Georgia"/>
+        </w:rPr>
+        <w:t xml:space="preserve"> and use</w:t>
+      </w:r>
+      <w:r>
+        <w:rPr>
+          <w:rFonts w:ascii="Georgia" w:hAnsi="Georgia"/>
+        </w:rPr>
+        <w:t xml:space="preserve"> the requested model. The simulation module</w:t>
+      </w:r>
+      <w:r>
+        <w:rPr>
+          <w:rFonts w:ascii="Georgia" w:hAnsi="Georgia"/>
+        </w:rPr>
+        <w:t>s</w:t>
+      </w:r>
+      <w:r>
+        <w:rPr>
+          <w:rFonts w:ascii="Georgia" w:hAnsi="Georgia"/>
+        </w:rPr>
+        <w:t xml:space="preserve"> will then configure the model</w:t>
+      </w:r>
+      <w:r>
+        <w:rPr>
+          <w:rFonts w:ascii="Georgia" w:hAnsi="Georgia"/>
+        </w:rPr>
+        <w:t>s</w:t>
+      </w:r>
+      <w:r>
+        <w:rPr>
+          <w:rFonts w:ascii="Georgia" w:hAnsi="Georgia"/>
+        </w:rPr>
+        <w:t xml:space="preserve"> as requested, run the model</w:t>
+      </w:r>
+      <w:r>
+        <w:rPr>
+          <w:rFonts w:ascii="Georgia" w:hAnsi="Georgia"/>
+        </w:rPr>
+        <w:t>s</w:t>
+      </w:r>
+      <w:r>
+        <w:rPr>
+          <w:rFonts w:ascii="Georgia" w:hAnsi="Georgia"/>
+        </w:rPr>
+        <w:t xml:space="preserve"> on the specified data, and provide regularized outputs for the stage</w:t>
+      </w:r>
+      <w:r>
+        <w:rPr>
+          <w:rFonts w:ascii="Georgia" w:hAnsi="Georgia"/>
+        </w:rPr>
+        <w:t>s</w:t>
+      </w:r>
+      <w:r>
+        <w:rPr>
+          <w:rFonts w:ascii="Georgia" w:hAnsi="Georgia"/>
+        </w:rPr>
+        <w:t xml:space="preserve"> in question. In so doing we will enable the addition of new models to the framework without the overhead of a full codebase contribution.</w:t>
+      </w:r>
+    </w:p>
+    <w:p>
+      <w:pPr>
+        <w:rPr>
+          <w:rFonts w:ascii="Georgia" w:hAnsi="Georgia"/>
+        </w:rPr>
+      </w:pPr>
+      <w:r>
+        <w:rPr>
+          <w:rFonts w:ascii="Georgia" w:hAnsi="Georgia"/>
+        </w:rPr>
+        <w:t>Beyond this</w:t>
+      </w:r>
+      <w:r>
+        <w:rPr>
+          <w:rFonts w:ascii="Georgia" w:hAnsi="Georgia"/>
+        </w:rPr>
+        <w:t xml:space="preserve">, to save computation time and resources </w:t>
+      </w:r>
+      <w:r>
+        <w:rPr>
+          <w:rFonts w:ascii="Georgia" w:hAnsi="Georgia"/>
+        </w:rPr>
+        <w:t xml:space="preserve">we will build simulation modules </w:t>
+      </w:r>
+      <w:r>
+        <w:rPr>
+          <w:rFonts w:ascii="Georgia" w:hAnsi="Georgia"/>
+        </w:rPr>
+        <w:t>s</w:t>
+      </w:r>
+      <w:r>
+        <w:rPr>
+          <w:rFonts w:ascii="Georgia" w:hAnsi="Georgia"/>
+        </w:rPr>
+        <w:t>uch</w:t>
+      </w:r>
+      <w:r>
+        <w:rPr>
+          <w:rFonts w:ascii="Georgia" w:hAnsi="Georgia"/>
+        </w:rPr>
+        <w:t xml:space="preserve"> that each stage is largely reusable by the stages that come after it. Rigid body movement data can be used with a large set of different tag models, the data from any of those of tag model simulation runs can be used with a variety of sensor models, and so on. Rerunning each of these unnecessarily would simply be a waste of resources.</w:t>
       </w:r>
     </w:p>
     <w:p>
@@ -1565,13 +1874,56 @@
       <w:pPr>
         <w:rPr>
           <w:rFonts w:ascii="Georgia" w:hAnsi="Georgia"/>
-        </w:rPr>
-      </w:pPr>
-      <w:r>
-        <w:rPr>
-          <w:rFonts w:ascii="Georgia" w:hAnsi="Georgia"/>
-        </w:rPr>
-        <w:t xml:space="preserve">To understand the requirements for each of these registries and models as well as collect the required models for this study we will proceed through a series of design steps intended to result in design documentation thorough enough for implementation by artificial intelligence. </w:t>
+          <w:i/>
+          <w:iCs/>
+        </w:rPr>
+      </w:pPr>
+      <w:r>
+        <w:rPr>
+          <w:rFonts w:ascii="Georgia" w:hAnsi="Georgia"/>
+          <w:b/>
+          <w:bCs/>
+        </w:rPr>
+        <w:t>Figure 2:</w:t>
+      </w:r>
+      <w:r>
+        <w:rPr>
+          <w:rFonts w:ascii="Georgia" w:hAnsi="Georgia"/>
+        </w:rPr>
+        <w:t xml:space="preserve"> </w:t>
+      </w:r>
+      <w:r>
+        <w:rPr>
+          <w:rFonts w:ascii="Georgia" w:hAnsi="Georgia"/>
+          <w:i/>
+          <w:iCs/>
+        </w:rPr>
+        <w:t xml:space="preserve">The stages of simulation and their corresponding modules and registries. </w:t>
+      </w:r>
+    </w:p>
+    <w:p>
+      <w:pPr>
+        <w:rPr>
+          <w:rFonts w:ascii="Georgia" w:hAnsi="Georgia"/>
+        </w:rPr>
+      </w:pPr>
+      <w:r>
+        <w:rPr>
+          <w:rFonts w:ascii="Georgia" w:hAnsi="Georgia"/>
+        </w:rPr>
+        <w:t xml:space="preserve">To understand the requirements for each of these registries </w:t>
+      </w:r>
+      <w:r>
+        <w:rPr>
+          <w:rFonts w:ascii="Georgia" w:hAnsi="Georgia"/>
+        </w:rPr>
+        <w:t>and</w:t>
+      </w:r>
+      <w:r>
+        <w:rPr>
+          <w:rFonts w:ascii="Georgia" w:hAnsi="Georgia"/>
+        </w:rPr>
+        <w:t xml:space="preserve"> collect the required models for this study we will proceed through a series of design steps intended to result in design documentation thorough enough for implementation by artificial intelligence. </w:t>
       </w:r>
     </w:p>
     <w:p>
@@ -1592,57 +1944,122 @@
         </w:rPr>
         <w:t xml:space="preserve"> we will identify three case study species </w:t>
       </w:r>
+      <w:r>
+        <w:rPr>
+          <w:rFonts w:ascii="Georgia" w:hAnsi="Georgia"/>
+        </w:rPr>
+        <w:t xml:space="preserve">(a teleost, </w:t>
+      </w:r>
+      <w:r>
+        <w:rPr>
+          <w:rFonts w:ascii="Georgia" w:hAnsi="Georgia"/>
+        </w:rPr>
+        <w:t xml:space="preserve">a </w:t>
+      </w:r>
+      <w:r>
+        <w:rPr>
+          <w:rFonts w:ascii="Georgia" w:hAnsi="Georgia"/>
+        </w:rPr>
+        <w:t>chondrichthyan</w:t>
+      </w:r>
+      <w:r>
+        <w:rPr>
+          <w:rFonts w:ascii="Georgia" w:hAnsi="Georgia"/>
+        </w:rPr>
+        <w:t xml:space="preserve">, and </w:t>
+      </w:r>
+      <w:r>
+        <w:rPr>
+          <w:rFonts w:ascii="Georgia" w:hAnsi="Georgia"/>
+        </w:rPr>
+        <w:t xml:space="preserve">a </w:t>
+      </w:r>
+      <w:r>
+        <w:rPr>
+          <w:rFonts w:ascii="Georgia" w:hAnsi="Georgia"/>
+        </w:rPr>
+        <w:t>cetacean) based on</w:t>
+      </w:r>
+      <w:r>
+        <w:rPr>
+          <w:rFonts w:ascii="Georgia" w:hAnsi="Georgia"/>
+        </w:rPr>
+        <w:t xml:space="preserve"> how well their behavior is already understood and their applicability as representatives for a class of animals. The intention here is to choose animals that will drive useful generalizations within the </w:t>
+      </w:r>
+      <w:r>
+        <w:rPr>
+          <w:rFonts w:ascii="Georgia" w:hAnsi="Georgia"/>
+        </w:rPr>
+        <w:t>simulation</w:t>
+      </w:r>
+      <w:r>
+        <w:rPr>
+          <w:rFonts w:ascii="Georgia" w:hAnsi="Georgia"/>
+        </w:rPr>
+        <w:t>.</w:t>
+      </w:r>
+    </w:p>
+    <w:p>
+      <w:pPr>
+        <w:rPr>
+          <w:rFonts w:ascii="Georgia" w:hAnsi="Georgia"/>
+        </w:rPr>
+      </w:pPr>
+      <w:r>
+        <w:rPr>
+          <w:rFonts w:ascii="Georgia" w:hAnsi="Georgia"/>
+        </w:rPr>
+        <w:lastRenderedPageBreak/>
+        <w:t xml:space="preserve">Next for each of these animals we will survey the literature and work with experts to determine the </w:t>
+      </w:r>
+      <w:r>
+        <w:rPr>
+          <w:rFonts w:ascii="Georgia" w:hAnsi="Georgia"/>
+        </w:rPr>
+        <w:t xml:space="preserve">representative </w:t>
+      </w:r>
+      <w:r>
+        <w:rPr>
+          <w:rFonts w:ascii="Georgia" w:hAnsi="Georgia"/>
+        </w:rPr>
+        <w:t>behaviors of interest for each species</w:t>
+      </w:r>
+      <w:r>
+        <w:rPr>
+          <w:rFonts w:ascii="Georgia" w:hAnsi="Georgia"/>
+        </w:rPr>
+        <w:t xml:space="preserve">. </w:t>
+      </w:r>
+      <w:r>
+        <w:rPr>
+          <w:rFonts w:ascii="Georgia" w:hAnsi="Georgia"/>
+        </w:rPr>
+        <w:t>The intention here is to capture th</w:t>
+      </w:r>
+      <w:r>
+        <w:rPr>
+          <w:rFonts w:ascii="Georgia" w:hAnsi="Georgia"/>
+        </w:rPr>
+        <w:t>ose</w:t>
+      </w:r>
+      <w:r>
+        <w:rPr>
+          <w:rFonts w:ascii="Georgia" w:hAnsi="Georgia"/>
+        </w:rPr>
+        <w:t xml:space="preserve"> aspects of the behaviors that would be important to model as opposed to capturing models of those behaviors with 100% fidelity – a set of </w:t>
+      </w:r>
       <w:proofErr w:type="gramStart"/>
       <w:r>
         <w:rPr>
           <w:rFonts w:ascii="Georgia" w:hAnsi="Georgia"/>
         </w:rPr>
-        <w:t>on the basis of</w:t>
+        <w:t>studies in their own right</w:t>
       </w:r>
       <w:proofErr w:type="gramEnd"/>
       <w:r>
         <w:rPr>
           <w:rFonts w:ascii="Georgia" w:hAnsi="Georgia"/>
         </w:rPr>
-        <w:t xml:space="preserve"> how well their behavior is already understood and their applicability as representatives for a class of animals. The intention here is to choose animals that will drive useful generalizations within the </w:t>
-      </w:r>
-      <w:r>
-        <w:rPr>
-          <w:rFonts w:ascii="Georgia" w:hAnsi="Georgia"/>
-        </w:rPr>
-        <w:t>simulation</w:t>
-      </w:r>
-      <w:r>
-        <w:rPr>
-          <w:rFonts w:ascii="Georgia" w:hAnsi="Georgia"/>
-        </w:rPr>
-        <w:t>.</w:t>
-      </w:r>
-    </w:p>
-    <w:p>
-      <w:pPr>
-        <w:rPr>
-          <w:rFonts w:ascii="Georgia" w:hAnsi="Georgia"/>
-        </w:rPr>
-      </w:pPr>
-      <w:r>
-        <w:rPr>
-          <w:rFonts w:ascii="Georgia" w:hAnsi="Georgia"/>
-        </w:rPr>
-        <w:t xml:space="preserve">Next for each of these animals we will survey the literature and work with experts to determine the behaviors of interest for each species as well as how to provide useful models of those behaviors within simulation. The intention here is to capture the aspects of the behaviors that would be important to model as opposed to capturing models of those behaviors with 100% fidelity – a set of </w:t>
-      </w:r>
-      <w:proofErr w:type="gramStart"/>
-      <w:r>
-        <w:rPr>
-          <w:rFonts w:ascii="Georgia" w:hAnsi="Georgia"/>
-        </w:rPr>
-        <w:t>studies in their own right</w:t>
-      </w:r>
-      <w:proofErr w:type="gramEnd"/>
-      <w:r>
-        <w:rPr>
-          <w:rFonts w:ascii="Georgia" w:hAnsi="Georgia"/>
-        </w:rPr>
         <w:t xml:space="preserve">. </w:t>
       </w:r>
     </w:p>
@@ -1656,41 +2073,246 @@
         <w:rPr>
           <w:rFonts w:ascii="Georgia" w:hAnsi="Georgia"/>
         </w:rPr>
+        <w:t>Once the behaviors have been identified</w:t>
+      </w:r>
+      <w:r>
+        <w:rPr>
+          <w:rFonts w:ascii="Georgia" w:hAnsi="Georgia"/>
+        </w:rPr>
+        <w:t>,</w:t>
+      </w:r>
+      <w:r>
+        <w:rPr>
+          <w:rFonts w:ascii="Georgia" w:hAnsi="Georgia"/>
+        </w:rPr>
+        <w:t xml:space="preserve"> we will work with the same set of experts to understand tag attachments and likely deviations from the body frame. Here we wish to find parametrizable representations of those deviations </w:t>
+      </w:r>
+      <w:r>
+        <w:rPr>
+          <w:rFonts w:ascii="Georgia" w:hAnsi="Georgia"/>
+        </w:rPr>
+        <w:t>to</w:t>
+      </w:r>
+      <w:r>
+        <w:rPr>
+          <w:rFonts w:ascii="Georgia" w:hAnsi="Georgia"/>
+        </w:rPr>
+        <w:t xml:space="preserve"> enable sensitivity analyses later. Examples of such deviations would be lag due to elastic attachment, </w:t>
+      </w:r>
+      <w:r>
+        <w:rPr>
+          <w:rFonts w:ascii="Georgia" w:hAnsi="Georgia"/>
+        </w:rPr>
+        <w:t xml:space="preserve">shifts in orientation due to </w:t>
+      </w:r>
+      <w:r>
+        <w:rPr>
+          <w:rFonts w:ascii="Georgia" w:hAnsi="Georgia"/>
+        </w:rPr>
+        <w:t xml:space="preserve">buoyancy, </w:t>
+      </w:r>
+      <w:r>
+        <w:rPr>
+          <w:rFonts w:ascii="Georgia" w:hAnsi="Georgia"/>
+        </w:rPr>
+        <w:t xml:space="preserve">noise </w:t>
+      </w:r>
+      <w:r>
+        <w:rPr>
+          <w:rFonts w:ascii="Georgia" w:hAnsi="Georgia"/>
+        </w:rPr>
+        <w:t>because of</w:t>
+      </w:r>
+      <w:r>
+        <w:rPr>
+          <w:rFonts w:ascii="Georgia" w:hAnsi="Georgia"/>
+        </w:rPr>
+        <w:t xml:space="preserve"> </w:t>
+      </w:r>
+      <w:r>
+        <w:rPr>
+          <w:rFonts w:ascii="Georgia" w:hAnsi="Georgia"/>
+        </w:rPr>
+        <w:t xml:space="preserve">turbulence, and so on. </w:t>
+      </w:r>
+    </w:p>
+    <w:p>
+      <w:pPr>
+        <w:rPr>
+          <w:rFonts w:ascii="Georgia" w:hAnsi="Georgia"/>
+        </w:rPr>
+      </w:pPr>
+      <w:r>
+        <w:rPr>
+          <w:rFonts w:ascii="Georgia" w:hAnsi="Georgia"/>
+        </w:rPr>
+        <w:t>With movement understood</w:t>
+      </w:r>
+      <w:r>
+        <w:rPr>
+          <w:rFonts w:ascii="Georgia" w:hAnsi="Georgia"/>
+        </w:rPr>
+        <w:t>,</w:t>
+      </w:r>
+      <w:r>
+        <w:rPr>
+          <w:rFonts w:ascii="Georgia" w:hAnsi="Georgia"/>
+        </w:rPr>
+        <w:t xml:space="preserve"> we will proceed to survey the available sensors on the market. Rather than attempting a</w:t>
+      </w:r>
+      <w:r>
+        <w:rPr>
+          <w:rFonts w:ascii="Georgia" w:hAnsi="Georgia"/>
+        </w:rPr>
+        <w:t xml:space="preserve">n exhaustive </w:t>
+      </w:r>
+      <w:r>
+        <w:rPr>
+          <w:rFonts w:ascii="Georgia" w:hAnsi="Georgia"/>
+        </w:rPr>
+        <w:t>force search of the space</w:t>
+      </w:r>
+      <w:r>
+        <w:rPr>
+          <w:rFonts w:ascii="Georgia" w:hAnsi="Georgia"/>
+        </w:rPr>
+        <w:t>,</w:t>
+      </w:r>
+      <w:r>
+        <w:rPr>
+          <w:rFonts w:ascii="Georgia" w:hAnsi="Georgia"/>
+        </w:rPr>
+        <w:t xml:space="preserve"> the intention will be to understand the boundaries of what is available </w:t>
+      </w:r>
+      <w:r>
+        <w:rPr>
+          <w:rFonts w:ascii="Georgia" w:hAnsi="Georgia"/>
+        </w:rPr>
+        <w:t>and find suitable representative sensors to include in the options within the simulation. Given the intention of the registry, if additional models need be added later that will be straightforward. In terms of the sensors</w:t>
+      </w:r>
+      <w:r>
+        <w:rPr>
+          <w:rFonts w:ascii="Georgia" w:hAnsi="Georgia"/>
+        </w:rPr>
+        <w:t>,</w:t>
+      </w:r>
+      <w:r>
+        <w:rPr>
+          <w:rFonts w:ascii="Georgia" w:hAnsi="Georgia"/>
+        </w:rPr>
+        <w:t xml:space="preserve"> we specifically seek to understand power and energy consumption, sizes, cost, available specifications (configuration), errors (bias, noise, etc.), rates, precision, and </w:t>
+      </w:r>
+      <w:r>
+        <w:rPr>
+          <w:rFonts w:ascii="Georgia" w:hAnsi="Georgia"/>
+        </w:rPr>
+        <w:t xml:space="preserve">measurement </w:t>
+      </w:r>
+      <w:r>
+        <w:rPr>
+          <w:rFonts w:ascii="Georgia" w:hAnsi="Georgia"/>
+        </w:rPr>
+        <w:t xml:space="preserve">bounds. </w:t>
+      </w:r>
+    </w:p>
+    <w:p>
+      <w:pPr>
+        <w:rPr>
+          <w:rFonts w:ascii="Georgia" w:hAnsi="Georgia"/>
+        </w:rPr>
+      </w:pPr>
+      <w:r>
+        <w:rPr>
+          <w:rFonts w:ascii="Georgia" w:hAnsi="Georgia"/>
+        </w:rPr>
+        <w:t xml:space="preserve">Next, with these in hand we will make proposals for the kinds of process models we will use. Process models can vary in terms of the state space, process noise, sensor inputs, and physical laws they use. An example of variation in the state space would be the choice between quaternions or Euler angles for headings, the inclusion or exclusion of acceleration, and so on. Process noise not only governs the expansion of uncertainty overtime but also enables indirect inclusion of forces/parameters not directly captured in the state space. In place of said process noise changes to the system can also be taken directly from the sensor measurements themselves if those sensors are accurate enough to dead reckon. Finally, the specific physical laws used to drive time evolution of the state have to be explicitly stated within the state space chosen. To facilitate the creation of a useful registry a variety of possible versions of each of the above will be proposed to understand the generalizations needed for the simulation. </w:t>
+      </w:r>
+    </w:p>
+    <w:p>
+      <w:pPr>
+        <w:rPr>
+          <w:rFonts w:ascii="Georgia" w:hAnsi="Georgia"/>
+        </w:rPr>
+      </w:pPr>
+      <w:r>
+        <w:rPr>
+          <w:rFonts w:ascii="Georgia" w:hAnsi="Georgia"/>
+        </w:rPr>
+        <w:t xml:space="preserve">In tandem with the process model the observation models will need specification. Here we will specify the functions by which a </w:t>
+      </w:r>
+      <w:r>
+        <w:rPr>
+          <w:rFonts w:ascii="Georgia" w:hAnsi="Georgia"/>
+        </w:rPr>
+        <w:t>measurement</w:t>
+      </w:r>
+      <w:r>
+        <w:rPr>
+          <w:rFonts w:ascii="Georgia" w:hAnsi="Georgia"/>
+        </w:rPr>
+        <w:t xml:space="preserve"> can converted into a state space distribution. There will be a class of these for each category of sensor (accelerometers vs depth sensors vs gyroscopes, etc.) each with their own set of hyperparameters.</w:t>
+      </w:r>
+    </w:p>
+    <w:p>
+      <w:pPr>
+        <w:rPr>
+          <w:rFonts w:ascii="Georgia" w:hAnsi="Georgia"/>
+        </w:rPr>
+      </w:pPr>
+      <w:r>
+        <w:rPr>
+          <w:rFonts w:ascii="Georgia" w:hAnsi="Georgia"/>
+        </w:rPr>
+        <w:t>W</w:t>
+      </w:r>
+      <w:r>
+        <w:rPr>
+          <w:rFonts w:ascii="Georgia" w:hAnsi="Georgia"/>
+        </w:rPr>
+        <w:t xml:space="preserve">hile the process model is free to use a state space most efficient for itself </w:t>
+      </w:r>
+      <w:r>
+        <w:rPr>
+          <w:rFonts w:ascii="Georgia" w:hAnsi="Georgia"/>
+        </w:rPr>
+        <w:t>to</w:t>
+      </w:r>
+      <w:r>
+        <w:rPr>
+          <w:rFonts w:ascii="Georgia" w:hAnsi="Georgia"/>
+        </w:rPr>
+        <w:t xml:space="preserve"> compare different runs and configurations</w:t>
+      </w:r>
+      <w:r>
+        <w:rPr>
+          <w:rFonts w:ascii="Georgia" w:hAnsi="Georgia"/>
+        </w:rPr>
+        <w:t>,</w:t>
+      </w:r>
+      <w:r>
+        <w:rPr>
+          <w:rFonts w:ascii="Georgia" w:hAnsi="Georgia"/>
+        </w:rPr>
+        <w:t xml:space="preserve"> converters will be required to take that state space and return it to the physical space the movement itself </w:t>
+      </w:r>
+      <w:r>
+        <w:rPr>
+          <w:rFonts w:ascii="Georgia" w:hAnsi="Georgia"/>
+        </w:rPr>
+        <w:t xml:space="preserve">is captured in. This coordinate </w:t>
+      </w:r>
+      <w:r>
+        <w:rPr>
+          <w:rFonts w:ascii="Georgia" w:hAnsi="Georgia"/>
+        </w:rPr>
         <w:lastRenderedPageBreak/>
-        <w:t xml:space="preserve">Once the behaviors have been identified we will work with the same set of experts to understand tag attachments and likely deviations from the body frame. Here we wish to find parametrizable representations of those deviations </w:t>
-      </w:r>
-      <w:proofErr w:type="gramStart"/>
-      <w:r>
-        <w:rPr>
-          <w:rFonts w:ascii="Georgia" w:hAnsi="Georgia"/>
-        </w:rPr>
-        <w:t>in order to</w:t>
-      </w:r>
-      <w:proofErr w:type="gramEnd"/>
-      <w:r>
-        <w:rPr>
-          <w:rFonts w:ascii="Georgia" w:hAnsi="Georgia"/>
-        </w:rPr>
-        <w:t xml:space="preserve"> enable sensitivity analyses later. Examples of such deviations would be lag due to elastic attachment, buoyancy, turbulence, and so on. </w:t>
-      </w:r>
-    </w:p>
-    <w:p>
-      <w:pPr>
-        <w:rPr>
-          <w:rFonts w:ascii="Georgia" w:hAnsi="Georgia"/>
-        </w:rPr>
-      </w:pPr>
-      <w:r>
-        <w:rPr>
-          <w:rFonts w:ascii="Georgia" w:hAnsi="Georgia"/>
-        </w:rPr>
-        <w:t xml:space="preserve">With movement understood we will proceed to survey the available sensors on the market. Rather than attempting a brute force search of the space the intention will be to understand the boundaries of what is available </w:t>
-      </w:r>
-      <w:r>
-        <w:rPr>
-          <w:rFonts w:ascii="Georgia" w:hAnsi="Georgia"/>
-        </w:rPr>
-        <w:t>and find suitable representative sensors to include in the options within the simulation. Given the intention of the registry, if additional models need be added later that will hopefully be reasonably straightforward. In terms of the sensors</w:t>
+        <w:t xml:space="preserve">space will then be used for visual comparison of the distributions. </w:t>
+      </w:r>
+      <w:r>
+        <w:rPr>
+          <w:rFonts w:ascii="Georgia" w:hAnsi="Georgia"/>
+        </w:rPr>
+        <w:t>As such</w:t>
       </w:r>
       <w:r>
         <w:rPr>
@@ -1702,94 +2324,237 @@
         <w:rPr>
           <w:rFonts w:ascii="Georgia" w:hAnsi="Georgia"/>
         </w:rPr>
-        <w:t xml:space="preserve"> we specifically seek to understand power and energy consumption, sizes, cost, available specifications (configuration), errors (bias, noise, etc.), rates, precision, and bounds. </w:t>
-      </w:r>
-    </w:p>
-    <w:p>
-      <w:pPr>
-        <w:rPr>
-          <w:rFonts w:ascii="Georgia" w:hAnsi="Georgia"/>
-        </w:rPr>
-      </w:pPr>
-      <w:r>
-        <w:rPr>
-          <w:rFonts w:ascii="Georgia" w:hAnsi="Georgia"/>
-        </w:rPr>
-        <w:t xml:space="preserve">Next, with these in hand we will need to make proposals for the kinds of process models we will use. Process models can vary in terms of the state space, process noise, sensor inputs, and physical laws they use. An example of variation in the state space would be the choice between quaternions or Euler angles for headings, the inclusion or exclusion of acceleration, and so on. Process noise not only governs the expansion of </w:t>
-      </w:r>
-      <w:r>
-        <w:rPr>
-          <w:rFonts w:ascii="Georgia" w:hAnsi="Georgia"/>
-        </w:rPr>
-        <w:t>uncertainty overtime but also enables indirect inclusion of forces/parameters not directly captured in the state space.</w:t>
-      </w:r>
-      <w:r>
-        <w:rPr>
-          <w:rFonts w:ascii="Georgia" w:hAnsi="Georgia"/>
-        </w:rPr>
-        <w:t xml:space="preserve"> In place of said process noise changes to the system can also be taken directly from the sensor measurements themselves if those sensors are accurate enough to dead reckon. Finally, the specific physical laws used to drive time evolution of the state have to be explicitly stated within the state space chosen. </w:t>
-      </w:r>
-    </w:p>
-    <w:p>
-      <w:pPr>
-        <w:rPr>
-          <w:rFonts w:ascii="Georgia" w:hAnsi="Georgia"/>
-        </w:rPr>
-      </w:pPr>
-      <w:r>
-        <w:rPr>
-          <w:rFonts w:ascii="Georgia" w:hAnsi="Georgia"/>
-        </w:rPr>
-        <w:t xml:space="preserve">To facilitate the creation of a useful registry a variety of possible versions of each of the above will be proposed to understand the generalizations needed for the simulation. </w:t>
-      </w:r>
-    </w:p>
-    <w:p>
-      <w:pPr>
-        <w:rPr>
-          <w:rFonts w:ascii="Georgia" w:hAnsi="Georgia"/>
-        </w:rPr>
-      </w:pPr>
-      <w:r>
-        <w:rPr>
-          <w:rFonts w:ascii="Georgia" w:hAnsi="Georgia"/>
-        </w:rPr>
-        <w:t xml:space="preserve">In tandem with the process model the observation models will need specification. </w:t>
-      </w:r>
-      <w:r>
-        <w:rPr>
-          <w:rFonts w:ascii="Georgia" w:hAnsi="Georgia"/>
-        </w:rPr>
-        <w:t xml:space="preserve">Here we </w:t>
-      </w:r>
-      <w:r>
-        <w:rPr>
-          <w:rFonts w:ascii="Georgia" w:hAnsi="Georgia"/>
-        </w:rPr>
-        <w:t xml:space="preserve">will specify the </w:t>
-      </w:r>
-      <w:r>
-        <w:rPr>
-          <w:rFonts w:ascii="Georgia" w:hAnsi="Georgia"/>
-        </w:rPr>
-        <w:t>function</w:t>
-      </w:r>
-      <w:r>
-        <w:rPr>
-          <w:rFonts w:ascii="Georgia" w:hAnsi="Georgia"/>
-        </w:rPr>
-        <w:t>s</w:t>
-      </w:r>
-      <w:r>
-        <w:rPr>
-          <w:rFonts w:ascii="Georgia" w:hAnsi="Georgia"/>
-        </w:rPr>
-        <w:t xml:space="preserve"> by which a </w:t>
-      </w:r>
-      <w:r>
-        <w:rPr>
-          <w:rFonts w:ascii="Georgia" w:hAnsi="Georgia"/>
-        </w:rPr>
-        <w:t>measurement</w:t>
+        <w:t xml:space="preserve"> careful planning of its coordinates will be necessary. </w:t>
+      </w:r>
+    </w:p>
+    <w:p>
+      <w:pPr>
+        <w:rPr>
+          <w:rFonts w:ascii="Georgia" w:hAnsi="Georgia"/>
+        </w:rPr>
+      </w:pPr>
+      <w:r>
+        <w:rPr>
+          <w:rFonts w:ascii="Georgia" w:hAnsi="Georgia"/>
+        </w:rPr>
+        <w:t>Finally,</w:t>
+      </w:r>
+      <w:r>
+        <w:rPr>
+          <w:rFonts w:ascii="Georgia" w:hAnsi="Georgia"/>
+        </w:rPr>
+        <w:t xml:space="preserve"> we will wireframe both the simulation UI and the inspector UI used for comparing the state and observation distributions to the actual state. That inspector will need to be able to display for a selected timepoint (1) </w:t>
+      </w:r>
+      <w:r>
+        <w:rPr>
+          <w:rFonts w:ascii="Georgia" w:hAnsi="Georgia"/>
+        </w:rPr>
+        <w:t xml:space="preserve">the </w:t>
+      </w:r>
+      <w:r>
+        <w:rPr>
+          <w:rFonts w:ascii="Georgia" w:hAnsi="Georgia"/>
+        </w:rPr>
+        <w:t>pre-progression state distribution</w:t>
+      </w:r>
+      <w:r>
+        <w:rPr>
+          <w:rFonts w:ascii="Georgia" w:hAnsi="Georgia"/>
+        </w:rPr>
+        <w:t>,</w:t>
+      </w:r>
+      <w:r>
+        <w:rPr>
+          <w:rFonts w:ascii="Georgia" w:hAnsi="Georgia"/>
+        </w:rPr>
+        <w:t xml:space="preserve"> (2) </w:t>
+      </w:r>
+      <w:r>
+        <w:rPr>
+          <w:rFonts w:ascii="Georgia" w:hAnsi="Georgia"/>
+        </w:rPr>
+        <w:t xml:space="preserve">the </w:t>
+      </w:r>
+      <w:r>
+        <w:rPr>
+          <w:rFonts w:ascii="Georgia" w:hAnsi="Georgia"/>
+        </w:rPr>
+        <w:t>p</w:t>
+      </w:r>
+      <w:r>
+        <w:rPr>
+          <w:rFonts w:ascii="Georgia" w:hAnsi="Georgia"/>
+        </w:rPr>
+        <w:t>ost-progression state distribution</w:t>
+      </w:r>
+      <w:r>
+        <w:rPr>
+          <w:rFonts w:ascii="Georgia" w:hAnsi="Georgia"/>
+        </w:rPr>
+        <w:t>,</w:t>
+      </w:r>
+      <w:r>
+        <w:rPr>
+          <w:rFonts w:ascii="Georgia" w:hAnsi="Georgia"/>
+        </w:rPr>
+        <w:t xml:space="preserve"> (3) a</w:t>
+      </w:r>
+      <w:r>
+        <w:rPr>
+          <w:rFonts w:ascii="Georgia" w:hAnsi="Georgia"/>
+        </w:rPr>
+        <w:t>ny selected observation distributions</w:t>
+      </w:r>
+      <w:r>
+        <w:rPr>
+          <w:rFonts w:ascii="Georgia" w:hAnsi="Georgia"/>
+        </w:rPr>
+        <w:t>,</w:t>
+      </w:r>
+      <w:r>
+        <w:rPr>
+          <w:rFonts w:ascii="Georgia" w:hAnsi="Georgia"/>
+        </w:rPr>
+        <w:t xml:space="preserve"> and (4) t</w:t>
+      </w:r>
+      <w:r>
+        <w:rPr>
+          <w:rFonts w:ascii="Georgia" w:hAnsi="Georgia"/>
+        </w:rPr>
+        <w:t>he actual tag state and body state</w:t>
+      </w:r>
+      <w:r>
+        <w:rPr>
+          <w:rFonts w:ascii="Georgia" w:hAnsi="Georgia"/>
+        </w:rPr>
+        <w:t>. Beyond this it will need to provide the means to switch between (1) different simulation runs</w:t>
+      </w:r>
+      <w:r>
+        <w:rPr>
+          <w:rFonts w:ascii="Georgia" w:hAnsi="Georgia"/>
+        </w:rPr>
+        <w:t>,</w:t>
+      </w:r>
+      <w:r>
+        <w:rPr>
+          <w:rFonts w:ascii="Georgia" w:hAnsi="Georgia"/>
+        </w:rPr>
+        <w:t xml:space="preserve"> (2) different projections of the physical space (as it will have high dimensionality)</w:t>
+      </w:r>
+      <w:r>
+        <w:rPr>
+          <w:rFonts w:ascii="Georgia" w:hAnsi="Georgia"/>
+        </w:rPr>
+        <w:t>,</w:t>
+      </w:r>
+      <w:r>
+        <w:rPr>
+          <w:rFonts w:ascii="Georgia" w:hAnsi="Georgia"/>
+        </w:rPr>
+        <w:t xml:space="preserve"> and (3) the different available observation distributions. Finally</w:t>
+      </w:r>
+      <w:r>
+        <w:rPr>
+          <w:rFonts w:ascii="Georgia" w:hAnsi="Georgia"/>
+        </w:rPr>
+        <w:t>,</w:t>
+      </w:r>
+      <w:r>
+        <w:rPr>
+          <w:rFonts w:ascii="Georgia" w:hAnsi="Georgia"/>
+        </w:rPr>
+        <w:t xml:space="preserve"> given there can be many epochs we will want to display a timeline of relevant statistics (such as state distribution entropy) that </w:t>
+      </w:r>
+      <w:r>
+        <w:rPr>
+          <w:rFonts w:ascii="Georgia" w:hAnsi="Georgia"/>
+        </w:rPr>
+        <w:t xml:space="preserve">will </w:t>
+      </w:r>
+      <w:r>
+        <w:rPr>
+          <w:rFonts w:ascii="Georgia" w:hAnsi="Georgia"/>
+        </w:rPr>
+        <w:t>enable a user to quickly pick out timepoints of interest.</w:t>
+      </w:r>
+    </w:p>
+    <w:p>
+      <w:pPr>
+        <w:rPr>
+          <w:rFonts w:ascii="Georgia" w:hAnsi="Georgia"/>
+        </w:rPr>
+      </w:pPr>
+      <w:r>
+        <w:rPr>
+          <w:rFonts w:ascii="Georgia" w:hAnsi="Georgia"/>
+        </w:rPr>
+        <w:t xml:space="preserve">With </w:t>
+      </w:r>
+      <w:r>
+        <w:rPr>
+          <w:rFonts w:ascii="Georgia" w:hAnsi="Georgia"/>
+        </w:rPr>
+        <w:t>all</w:t>
+      </w:r>
+      <w:r>
+        <w:rPr>
+          <w:rFonts w:ascii="Georgia" w:hAnsi="Georgia"/>
+        </w:rPr>
+        <w:t xml:space="preserve"> this information in place we will then proceed to create specifications for each registry, </w:t>
+      </w:r>
+      <w:r>
+        <w:rPr>
+          <w:rFonts w:ascii="Georgia" w:hAnsi="Georgia"/>
+        </w:rPr>
+        <w:t xml:space="preserve">simulation </w:t>
+      </w:r>
+      <w:r>
+        <w:rPr>
+          <w:rFonts w:ascii="Georgia" w:hAnsi="Georgia"/>
+        </w:rPr>
+        <w:t xml:space="preserve">module, and </w:t>
+      </w:r>
+      <w:r>
+        <w:rPr>
+          <w:rFonts w:ascii="Georgia" w:hAnsi="Georgia"/>
+        </w:rPr>
+        <w:t xml:space="preserve">for </w:t>
+      </w:r>
+      <w:r>
+        <w:rPr>
+          <w:rFonts w:ascii="Georgia" w:hAnsi="Georgia"/>
+        </w:rPr>
+        <w:t xml:space="preserve">the components that will go into </w:t>
+      </w:r>
+      <w:r>
+        <w:rPr>
+          <w:rFonts w:ascii="Georgia" w:hAnsi="Georgia"/>
+        </w:rPr>
+        <w:t>those</w:t>
+      </w:r>
+      <w:r>
+        <w:rPr>
+          <w:rFonts w:ascii="Georgia" w:hAnsi="Georgia"/>
+        </w:rPr>
+        <w:t xml:space="preserve"> registr</w:t>
+      </w:r>
+      <w:r>
+        <w:rPr>
+          <w:rFonts w:ascii="Georgia" w:hAnsi="Georgia"/>
+        </w:rPr>
+        <w:t>ies</w:t>
+      </w:r>
+      <w:r>
+        <w:rPr>
+          <w:rFonts w:ascii="Georgia" w:hAnsi="Georgia"/>
+        </w:rPr>
+        <w:t>. Furthermore</w:t>
+      </w:r>
+      <w:r>
+        <w:rPr>
+          <w:rFonts w:ascii="Georgia" w:hAnsi="Georgia"/>
+        </w:rPr>
+        <w:t>,</w:t>
       </w:r>
       <w:r>
         <w:rPr>
@@ -1801,182 +2566,28 @@
         <w:rPr>
           <w:rFonts w:ascii="Georgia" w:hAnsi="Georgia"/>
         </w:rPr>
-        <w:t>can</w:t>
-      </w:r>
-      <w:r>
-        <w:rPr>
-          <w:rFonts w:ascii="Georgia" w:hAnsi="Georgia"/>
-        </w:rPr>
-        <w:t xml:space="preserve"> converted into a state space distribution. There will be a class of these for each category of sensor (accelerometers vs depth sensors vs gyroscopes, etc.) each with their own set of hyperparameters.</w:t>
-      </w:r>
-    </w:p>
-    <w:p>
-      <w:pPr>
-        <w:rPr>
-          <w:rFonts w:ascii="Georgia" w:hAnsi="Georgia"/>
-        </w:rPr>
-      </w:pPr>
-      <w:r>
-        <w:rPr>
-          <w:rFonts w:ascii="Georgia" w:hAnsi="Georgia"/>
-        </w:rPr>
-        <w:t>W</w:t>
-      </w:r>
-      <w:r>
-        <w:rPr>
-          <w:rFonts w:ascii="Georgia" w:hAnsi="Georgia"/>
-        </w:rPr>
-        <w:t xml:space="preserve">hile the process model is free to use a state space most efficient for itself </w:t>
-      </w:r>
-      <w:r>
-        <w:rPr>
-          <w:rFonts w:ascii="Georgia" w:hAnsi="Georgia"/>
-        </w:rPr>
-        <w:t>to</w:t>
-      </w:r>
-      <w:r>
-        <w:rPr>
-          <w:rFonts w:ascii="Georgia" w:hAnsi="Georgia"/>
-        </w:rPr>
-        <w:t xml:space="preserve"> compare different runs and configurations converters will be required to take that state space and return it to the physical space the movement itself </w:t>
-      </w:r>
-      <w:r>
-        <w:rPr>
-          <w:rFonts w:ascii="Georgia" w:hAnsi="Georgia"/>
-        </w:rPr>
-        <w:t xml:space="preserve">is captured in. This coordinate space will then be the one used for visual comparison of the distributions. </w:t>
-      </w:r>
-      <w:r>
-        <w:rPr>
-          <w:rFonts w:ascii="Georgia" w:hAnsi="Georgia"/>
-        </w:rPr>
-        <w:t>Therefore,</w:t>
-      </w:r>
-      <w:r>
-        <w:rPr>
-          <w:rFonts w:ascii="Georgia" w:hAnsi="Georgia"/>
-        </w:rPr>
-        <w:t xml:space="preserve"> careful planning of its coordinates will be necessary. </w:t>
-      </w:r>
-    </w:p>
-    <w:p>
-      <w:pPr>
-        <w:rPr>
-          <w:rFonts w:ascii="Georgia" w:hAnsi="Georgia"/>
-        </w:rPr>
-      </w:pPr>
-      <w:r>
-        <w:rPr>
-          <w:rFonts w:ascii="Georgia" w:hAnsi="Georgia"/>
-        </w:rPr>
-        <w:t>Finally,</w:t>
-      </w:r>
-      <w:r>
-        <w:rPr>
-          <w:rFonts w:ascii="Georgia" w:hAnsi="Georgia"/>
-        </w:rPr>
-        <w:t xml:space="preserve"> we will wireframe both the simulation UI and the inspector UI used for comparing the state and observation distributions to the actual state. That inspector will need to be able to display for a selected timepoint (1) p</w:t>
-      </w:r>
-      <w:r>
-        <w:rPr>
-          <w:rFonts w:ascii="Georgia" w:hAnsi="Georgia"/>
-        </w:rPr>
-        <w:t>re-progression state distribution</w:t>
-      </w:r>
-      <w:r>
-        <w:rPr>
-          <w:rFonts w:ascii="Georgia" w:hAnsi="Georgia"/>
-        </w:rPr>
-        <w:t xml:space="preserve"> (2) p</w:t>
-      </w:r>
-      <w:r>
-        <w:rPr>
-          <w:rFonts w:ascii="Georgia" w:hAnsi="Georgia"/>
-        </w:rPr>
-        <w:t>ost-progression state distribution</w:t>
-      </w:r>
-      <w:r>
-        <w:rPr>
-          <w:rFonts w:ascii="Georgia" w:hAnsi="Georgia"/>
-        </w:rPr>
-        <w:t xml:space="preserve"> (3) a</w:t>
-      </w:r>
-      <w:r>
-        <w:rPr>
-          <w:rFonts w:ascii="Georgia" w:hAnsi="Georgia"/>
-        </w:rPr>
-        <w:t>ny selected observation distributions</w:t>
-      </w:r>
-      <w:r>
-        <w:rPr>
-          <w:rFonts w:ascii="Georgia" w:hAnsi="Georgia"/>
-        </w:rPr>
-        <w:t xml:space="preserve"> and (4) </w:t>
-      </w:r>
-      <w:r>
-        <w:rPr>
-          <w:rFonts w:ascii="Georgia" w:hAnsi="Georgia"/>
-        </w:rPr>
-        <w:lastRenderedPageBreak/>
-        <w:t>t</w:t>
-      </w:r>
-      <w:r>
-        <w:rPr>
-          <w:rFonts w:ascii="Georgia" w:hAnsi="Georgia"/>
-        </w:rPr>
-        <w:t>he actual tag state and body state</w:t>
-      </w:r>
-      <w:r>
-        <w:rPr>
-          <w:rFonts w:ascii="Georgia" w:hAnsi="Georgia"/>
-        </w:rPr>
-        <w:t xml:space="preserve">. Beyond this it will need to provide the means to switch between (1) different simulation runs (2) different projections of the physical space (as it will have high dimensionality) and (3) the different available observation distributions. </w:t>
-      </w:r>
-      <w:r>
-        <w:rPr>
-          <w:rFonts w:ascii="Georgia" w:hAnsi="Georgia"/>
-        </w:rPr>
-        <w:t>Finally given there can be many epochs we will want to display a timeline of relevant statistics (such as state distribution entropy) that enable a user to quickly pick out timepoints of interest.</w:t>
-      </w:r>
-    </w:p>
-    <w:p>
-      <w:pPr>
-        <w:rPr>
-          <w:rFonts w:ascii="Georgia" w:hAnsi="Georgia"/>
-        </w:rPr>
-      </w:pPr>
-      <w:r>
-        <w:rPr>
-          <w:rFonts w:ascii="Georgia" w:hAnsi="Georgia"/>
-        </w:rPr>
-        <w:t xml:space="preserve">With </w:t>
-      </w:r>
-      <w:proofErr w:type="gramStart"/>
-      <w:r>
-        <w:rPr>
-          <w:rFonts w:ascii="Georgia" w:hAnsi="Georgia"/>
-        </w:rPr>
-        <w:t>all of</w:t>
-      </w:r>
-      <w:proofErr w:type="gramEnd"/>
-      <w:r>
-        <w:rPr>
-          <w:rFonts w:ascii="Georgia" w:hAnsi="Georgia"/>
-        </w:rPr>
-        <w:t xml:space="preserve"> this information in place we will then proceed to create specifications for each registry, module, and the components that will go into that registry. Furthermore</w:t>
-      </w:r>
-      <w:r>
-        <w:rPr>
-          <w:rFonts w:ascii="Georgia" w:hAnsi="Georgia"/>
-        </w:rPr>
-        <w:t>,</w:t>
-      </w:r>
-      <w:r>
-        <w:rPr>
-          <w:rFonts w:ascii="Georgia" w:hAnsi="Georgia"/>
-        </w:rPr>
-        <w:t xml:space="preserve"> we will make any technology selections at this point in terms of the sensor fusion libraries to use</w:t>
-      </w:r>
+        <w:t>at this point we</w:t>
+      </w:r>
+      <w:r>
+        <w:rPr>
+          <w:rFonts w:ascii="Georgia" w:hAnsi="Georgia"/>
+        </w:rPr>
+        <w:t xml:space="preserve"> will make any technology selections in terms of the sensor fusion libraries to use</w:t>
+      </w:r>
+      <w:r>
+        <w:rPr>
+          <w:rFonts w:ascii="Georgia" w:hAnsi="Georgia"/>
+        </w:rPr>
+        <w:t xml:space="preserve"> (</w:t>
+      </w:r>
+      <w:proofErr w:type="spellStart"/>
+      <w:r>
+        <w:rPr>
+          <w:rFonts w:ascii="Georgia" w:hAnsi="Georgia"/>
+        </w:rPr>
+        <w:t>StoneSoup</w:t>
+      </w:r>
+      <w:proofErr w:type="spellEnd"/>
       <w:r>
         <w:rPr>
           <w:rFonts w:ascii="Georgia" w:hAnsi="Georgia"/>
@@ -1989,12 +2600,42 @@
         </w:rPr>
         <w:t>(</w:t>
       </w:r>
+      <w:r>
+        <w:rPr>
+          <w:rFonts w:ascii="Georgia" w:hAnsi="Georgia"/>
+        </w:rPr>
+        <w:t>Hiscocks</w:t>
+      </w:r>
+      <w:r>
+        <w:rPr>
+          <w:rFonts w:ascii="Georgia" w:hAnsi="Georgia"/>
+        </w:rPr>
+        <w:t xml:space="preserve">, </w:t>
+      </w:r>
+      <w:r>
+        <w:rPr>
+          <w:rFonts w:ascii="Georgia" w:hAnsi="Georgia"/>
+        </w:rPr>
+        <w:t>2023</w:t>
+      </w:r>
+      <w:r>
+        <w:rPr>
+          <w:rFonts w:ascii="Georgia" w:hAnsi="Georgia"/>
+        </w:rPr>
+        <w:t xml:space="preserve">) </w:t>
+      </w:r>
+      <w:r>
+        <w:rPr>
+          <w:rFonts w:ascii="Georgia" w:hAnsi="Georgia"/>
+        </w:rPr>
+        <w:t xml:space="preserve">or </w:t>
+      </w:r>
       <w:proofErr w:type="spellStart"/>
       <w:r>
         <w:rPr>
           <w:rFonts w:ascii="Georgia" w:hAnsi="Georgia"/>
         </w:rPr>
-        <w:t>StoneSoup</w:t>
+        <w:t>Dynamax</w:t>
       </w:r>
       <w:proofErr w:type="spellEnd"/>
       <w:r>
@@ -2007,7 +2648,56 @@
         <w:rPr>
           <w:rFonts w:ascii="Georgia" w:hAnsi="Georgia"/>
         </w:rPr>
-        <w:t>or</w:t>
+        <w:t>(</w:t>
+      </w:r>
+      <w:r>
+        <w:rPr>
+          <w:rFonts w:ascii="Georgia" w:hAnsi="Georgia"/>
+        </w:rPr>
+        <w:t>Linderman</w:t>
+      </w:r>
+      <w:r>
+        <w:rPr>
+          <w:rFonts w:ascii="Georgia" w:hAnsi="Georgia"/>
+        </w:rPr>
+        <w:t xml:space="preserve">, 2025) </w:t>
+      </w:r>
+      <w:r>
+        <w:rPr>
+          <w:rFonts w:ascii="Georgia" w:hAnsi="Georgia"/>
+        </w:rPr>
+        <w:t>for example)</w:t>
+      </w:r>
+      <w:r>
+        <w:rPr>
+          <w:rFonts w:ascii="Georgia" w:hAnsi="Georgia"/>
+        </w:rPr>
+        <w:t xml:space="preserve">, UI libraries to use, data formats, warehouse design, labeling and tracking, and so on. </w:t>
+      </w:r>
+      <w:r>
+        <w:rPr>
+          <w:rFonts w:ascii="Georgia" w:hAnsi="Georgia"/>
+        </w:rPr>
+        <w:t xml:space="preserve">The outcome at this stage should be a complete design and specification of the simulation and the initial entries for the registry. </w:t>
+      </w:r>
+    </w:p>
+    <w:p>
+      <w:pPr>
+        <w:rPr>
+          <w:rFonts w:ascii="Georgia" w:hAnsi="Georgia"/>
+        </w:rPr>
+      </w:pPr>
+      <w:r>
+        <w:rPr>
+          <w:rFonts w:ascii="Georgia" w:hAnsi="Georgia"/>
+        </w:rPr>
+        <w:t xml:space="preserve">Those designs will then be passed to Claude </w:t>
+      </w:r>
+      <w:r>
+        <w:rPr>
+          <w:rFonts w:ascii="Georgia" w:hAnsi="Georgia"/>
+        </w:rPr>
+        <w:t>for implementation</w:t>
       </w:r>
       <w:r>
         <w:rPr>
@@ -2015,44 +2705,23 @@
         </w:rPr>
         <w:t xml:space="preserve"> </w:t>
       </w:r>
-      <w:proofErr w:type="spellStart"/>
-      <w:r>
-        <w:rPr>
-          <w:rFonts w:ascii="Georgia" w:hAnsi="Georgia"/>
-        </w:rPr>
-        <w:t>Dynamax</w:t>
-      </w:r>
-      <w:proofErr w:type="spellEnd"/>
-      <w:r>
-        <w:rPr>
-          <w:rFonts w:ascii="Georgia" w:hAnsi="Georgia"/>
-        </w:rPr>
-        <w:t xml:space="preserve"> for example)</w:t>
-      </w:r>
-      <w:r>
-        <w:rPr>
-          <w:rFonts w:ascii="Georgia" w:hAnsi="Georgia"/>
-        </w:rPr>
-        <w:t xml:space="preserve">, UI libraries to use, data formats, warehouse design, labeling and tracking, and so on. </w:t>
-      </w:r>
-      <w:r>
-        <w:rPr>
-          <w:rFonts w:ascii="Georgia" w:hAnsi="Georgia"/>
-        </w:rPr>
-        <w:t xml:space="preserve">The outcome at this stage should be a complete design and specification of the simulation and the initial entries for the registry. </w:t>
-      </w:r>
-    </w:p>
-    <w:p>
-      <w:pPr>
-        <w:rPr>
-          <w:rFonts w:ascii="Georgia" w:hAnsi="Georgia"/>
-        </w:rPr>
-      </w:pPr>
-      <w:r>
-        <w:rPr>
-          <w:rFonts w:ascii="Georgia" w:hAnsi="Georgia"/>
-        </w:rPr>
-        <w:t xml:space="preserve">Those designs will then be passed to Claude to construct the simulation. </w:t>
+      <w:r>
+        <w:rPr>
+          <w:rFonts w:ascii="Georgia" w:hAnsi="Georgia"/>
+        </w:rPr>
+        <w:t>of code which</w:t>
+      </w:r>
+      <w:r>
+        <w:rPr>
+          <w:rFonts w:ascii="Georgia" w:hAnsi="Georgia"/>
+        </w:rPr>
+        <w:t xml:space="preserve"> will then undergo human code review</w:t>
+      </w:r>
+      <w:r>
+        <w:rPr>
+          <w:rFonts w:ascii="Georgia" w:hAnsi="Georgia"/>
+        </w:rPr>
+        <w:t xml:space="preserve">. </w:t>
       </w:r>
     </w:p>
     <w:p>
@@ -2080,62 +2749,662 @@
         </w:rPr>
         <w:t>Case Studies</w:t>
       </w:r>
-    </w:p>
-    <w:p>
-      <w:pPr>
-        <w:rPr>
-          <w:rFonts w:ascii="Georgia" w:hAnsi="Georgia"/>
-        </w:rPr>
-      </w:pPr>
-      <w:r>
-        <w:rPr>
-          <w:rFonts w:ascii="Georgia" w:hAnsi="Georgia"/>
-        </w:rPr>
-        <w:t>We will first select a “nominal” case for each of the</w:t>
-      </w:r>
-      <w:r>
-        <w:rPr>
-          <w:rFonts w:ascii="Georgia" w:hAnsi="Georgia"/>
-        </w:rPr>
-        <w:t xml:space="preserve"> behaviors that represents a best-case scenario. For each of these we will then use the iterative approach described above to find a set of feasible solutions. In this process we will identify the main constraints in tag development for each species to help guide the selection of sensors and configurations given there are likely multiple such feasible solutions. </w:t>
-      </w:r>
-    </w:p>
-    <w:p>
-      <w:pPr>
-        <w:rPr>
-          <w:rFonts w:ascii="Georgia" w:hAnsi="Georgia"/>
-        </w:rPr>
-      </w:pPr>
-      <w:r>
-        <w:rPr>
-          <w:rFonts w:ascii="Georgia" w:hAnsi="Georgia"/>
-        </w:rPr>
-        <w:t xml:space="preserve">Once initial solutions are found we will then proceed to sensitivity analyses. This will involve varying the tag deviations, noise sources, and behavior parameters until we are satisfied that we have a solution that can withstand reasonable deviations from nominal conditions. </w:t>
-      </w:r>
-    </w:p>
-    <w:p>
-      <w:pPr>
-        <w:rPr>
-          <w:rFonts w:ascii="Georgia" w:hAnsi="Georgia"/>
-        </w:rPr>
-      </w:pPr>
-      <w:r>
-        <w:rPr>
-          <w:rFonts w:ascii="Georgia" w:hAnsi="Georgia"/>
-        </w:rPr>
-        <w:t xml:space="preserve">The ultimate outcome of this process will be a recommendation of </w:t>
-      </w:r>
-      <w:r>
-        <w:rPr>
-          <w:rFonts w:ascii="Georgia" w:hAnsi="Georgia"/>
-        </w:rPr>
-        <w:t xml:space="preserve">the </w:t>
-      </w:r>
-      <w:r>
-        <w:rPr>
-          <w:rFonts w:ascii="Georgia" w:hAnsi="Georgia"/>
-        </w:rPr>
-        <w:t>sensors, configurations, and filters along with characterizations of filter performance and curves expressing how performance changes around nominal conditions.</w:t>
+      <w:r>
+        <w:rPr>
+          <w:rFonts w:ascii="Georgia" w:hAnsi="Georgia"/>
+          <w:i/>
+          <w:iCs/>
+          <w:sz w:val="28"/>
+          <w:szCs w:val="28"/>
+        </w:rPr>
+        <w:t>: Nominal Conditions</w:t>
+      </w:r>
+    </w:p>
+    <w:p>
+      <w:pPr>
+        <w:rPr>
+          <w:rFonts w:ascii="Georgia" w:hAnsi="Georgia"/>
+        </w:rPr>
+      </w:pPr>
+      <w:r>
+        <w:rPr>
+          <w:rFonts w:ascii="Georgia" w:hAnsi="Georgia"/>
+        </w:rPr>
+        <w:t xml:space="preserve">We will first select a </w:t>
+      </w:r>
+      <w:r>
+        <w:rPr>
+          <w:rFonts w:ascii="Georgia" w:hAnsi="Georgia"/>
+        </w:rPr>
+        <w:t xml:space="preserve">starting behavior for each species </w:t>
+      </w:r>
+      <w:r>
+        <w:rPr>
+          <w:rFonts w:ascii="Georgia" w:hAnsi="Georgia"/>
+        </w:rPr>
+        <w:t xml:space="preserve">and simulate movements. </w:t>
+      </w:r>
+      <w:r>
+        <w:rPr>
+          <w:rFonts w:ascii="Georgia" w:hAnsi="Georgia"/>
+        </w:rPr>
+        <w:t>To</w:t>
+      </w:r>
+      <w:r>
+        <w:rPr>
+          <w:rFonts w:ascii="Georgia" w:hAnsi="Georgia"/>
+        </w:rPr>
+        <w:t xml:space="preserve"> capture the range of movements associated with that behavior we will sample from the parameter space of each of the behavior models to generate N simulations. </w:t>
+      </w:r>
+      <w:r>
+        <w:rPr>
+          <w:rFonts w:ascii="Georgia" w:hAnsi="Georgia"/>
+        </w:rPr>
+        <w:t>We will also select</w:t>
+      </w:r>
+      <w:r>
+        <w:rPr>
+          <w:rFonts w:ascii="Georgia" w:hAnsi="Georgia"/>
+        </w:rPr>
+        <w:t xml:space="preserve"> a “nominal” case for tag deviation from each of the representative species that represents a best-case scenario</w:t>
+      </w:r>
+      <w:r>
+        <w:rPr>
+          <w:rFonts w:ascii="Georgia" w:hAnsi="Georgia"/>
+        </w:rPr>
+        <w:t>.</w:t>
+      </w:r>
+      <w:r>
+        <w:rPr>
+          <w:rFonts w:ascii="Georgia" w:hAnsi="Georgia"/>
+        </w:rPr>
+        <w:t xml:space="preserve"> </w:t>
+      </w:r>
+      <w:r>
+        <w:rPr>
+          <w:rFonts w:ascii="Georgia" w:hAnsi="Georgia"/>
+        </w:rPr>
+        <w:t>To represent these deviations appropriately</w:t>
+      </w:r>
+      <w:r>
+        <w:rPr>
+          <w:rFonts w:ascii="Georgia" w:hAnsi="Georgia"/>
+        </w:rPr>
+        <w:t xml:space="preserve">, we will sample M times from the tag deviations chosen for the nominal case to end up with NM examples. </w:t>
+      </w:r>
+    </w:p>
+    <w:p>
+      <w:pPr>
+        <w:rPr>
+          <w:rFonts w:ascii="Georgia" w:hAnsi="Georgia"/>
+        </w:rPr>
+      </w:pPr>
+      <w:r>
+        <w:rPr>
+          <w:rFonts w:ascii="Georgia" w:hAnsi="Georgia"/>
+        </w:rPr>
+        <w:t xml:space="preserve">We will select 1 example out of these samples for each of the 3 starting behaviors and use the iterative approach described above to search for a feasible solution. To define feasibility, we will need to select a tolerance beyond which the </w:t>
+      </w:r>
+      <w:r>
+        <w:rPr>
+          <w:rFonts w:ascii="Georgia" w:hAnsi="Georgia"/>
+        </w:rPr>
+        <w:t xml:space="preserve">average </w:t>
+      </w:r>
+      <w:r>
+        <w:rPr>
+          <w:rFonts w:ascii="Georgia" w:hAnsi="Georgia"/>
+        </w:rPr>
+        <w:t xml:space="preserve">deviation of the fused state </w:t>
+      </w:r>
+      <w:r>
+        <w:rPr>
+          <w:rFonts w:ascii="Georgia" w:hAnsi="Georgia"/>
+        </w:rPr>
+        <w:t xml:space="preserve">over the state distribution </w:t>
+      </w:r>
+      <w:r>
+        <w:rPr>
+          <w:rFonts w:ascii="Georgia" w:hAnsi="Georgia"/>
+        </w:rPr>
+        <w:t>cannot exceed. Specifically, we can, for each point in the fused state distribution compute the squared deviation from the actual state of the tag and then sum these</w:t>
+      </w:r>
+      <w:r>
+        <w:rPr>
+          <w:rFonts w:ascii="Georgia" w:hAnsi="Georgia"/>
+        </w:rPr>
+        <w:t>,</w:t>
+      </w:r>
+      <w:r>
+        <w:rPr>
+          <w:rFonts w:ascii="Georgia" w:hAnsi="Georgia"/>
+        </w:rPr>
+        <w:t xml:space="preserve"> weighted by the probabilities given by the filter</w:t>
+      </w:r>
+      <w:r>
+        <w:rPr>
+          <w:rFonts w:ascii="Georgia" w:hAnsi="Georgia"/>
+        </w:rPr>
+        <w:t>,</w:t>
+      </w:r>
+      <w:r>
+        <w:rPr>
+          <w:rFonts w:ascii="Georgia" w:hAnsi="Georgia"/>
+        </w:rPr>
+        <w:t xml:space="preserve"> to arrive at an averaged deviation. </w:t>
+      </w:r>
+      <w:r>
+        <w:rPr>
+          <w:rFonts w:ascii="Georgia" w:hAnsi="Georgia"/>
+        </w:rPr>
+        <w:t>To consider the actual state captured</w:t>
+      </w:r>
+      <w:r>
+        <w:rPr>
+          <w:rFonts w:ascii="Georgia" w:hAnsi="Georgia"/>
+        </w:rPr>
+        <w:t>,</w:t>
+      </w:r>
+      <w:r>
+        <w:rPr>
+          <w:rFonts w:ascii="Georgia" w:hAnsi="Georgia"/>
+        </w:rPr>
+        <w:t xml:space="preserve"> this averaged deviation must </w:t>
+      </w:r>
+      <w:r>
+        <w:rPr>
+          <w:rFonts w:ascii="Georgia" w:hAnsi="Georgia"/>
+        </w:rPr>
+        <w:lastRenderedPageBreak/>
+        <w:t xml:space="preserve">stay within specific bounds. We pose it this way instead of looking at overall error to ensure there are no large deviations that are then offset by low deviations elsewhere in time. </w:t>
+      </w:r>
+    </w:p>
+    <w:p>
+      <w:pPr>
+        <w:rPr>
+          <w:rFonts w:ascii="Georgia" w:hAnsi="Georgia"/>
+        </w:rPr>
+      </w:pPr>
+      <w:r>
+        <w:rPr>
+          <w:rFonts w:ascii="Georgia" w:hAnsi="Georgia"/>
+        </w:rPr>
+        <w:t xml:space="preserve">However, not all deviations are necessarily an issue. For example, if the intention is to capture strikes and we find a filter that can do so but over time creates horizontal drift this is not </w:t>
+      </w:r>
+      <w:r>
+        <w:rPr>
+          <w:rFonts w:ascii="Georgia" w:hAnsi="Georgia"/>
+        </w:rPr>
+        <w:t>necessarily</w:t>
+      </w:r>
+      <w:r>
+        <w:rPr>
+          <w:rFonts w:ascii="Georgia" w:hAnsi="Georgia"/>
+        </w:rPr>
+        <w:t xml:space="preserve"> an issue given we can still identify the strikes within the drift. Therefore, we will need to account for and strip such drifts out of our </w:t>
+      </w:r>
+      <w:r>
+        <w:rPr>
+          <w:rFonts w:ascii="Georgia" w:hAnsi="Georgia"/>
+        </w:rPr>
+        <w:t>tolerance evaluation.</w:t>
+      </w:r>
+    </w:p>
+    <w:p>
+      <w:pPr>
+        <w:rPr>
+          <w:rFonts w:ascii="Georgia" w:hAnsi="Georgia"/>
+        </w:rPr>
+      </w:pPr>
+      <w:r>
+        <w:rPr>
+          <w:rFonts w:ascii="Georgia" w:hAnsi="Georgia"/>
+        </w:rPr>
+        <w:t>Likewise, given we will be working with filters that update through time</w:t>
+      </w:r>
+      <w:r>
+        <w:rPr>
+          <w:rFonts w:ascii="Georgia" w:hAnsi="Georgia"/>
+        </w:rPr>
+        <w:t>,</w:t>
+      </w:r>
+      <w:r>
+        <w:rPr>
+          <w:rFonts w:ascii="Georgia" w:hAnsi="Georgia"/>
+        </w:rPr>
+        <w:t xml:space="preserve"> there will always be a lag implicit in any filter where it takes some number of observations to collapse the state after a large </w:t>
+      </w:r>
+      <w:r>
+        <w:rPr>
+          <w:rFonts w:ascii="Georgia" w:hAnsi="Georgia"/>
+        </w:rPr>
+        <w:t xml:space="preserve">change </w:t>
+      </w:r>
+      <w:r>
+        <w:rPr>
+          <w:rFonts w:ascii="Georgia" w:hAnsi="Georgia"/>
+        </w:rPr>
+        <w:t>has taken place. Given some amount of lag is implicit we will need to identify what amount of lag is tolerable and then exclud</w:t>
+      </w:r>
+      <w:r>
+        <w:rPr>
+          <w:rFonts w:ascii="Georgia" w:hAnsi="Georgia"/>
+        </w:rPr>
+        <w:t>e</w:t>
+      </w:r>
+      <w:r>
+        <w:rPr>
+          <w:rFonts w:ascii="Georgia" w:hAnsi="Georgia"/>
+        </w:rPr>
+        <w:t xml:space="preserve"> this from our evaluation of tolerance as well. </w:t>
+      </w:r>
+    </w:p>
+    <w:p>
+      <w:pPr>
+        <w:rPr>
+          <w:rFonts w:ascii="Georgia" w:hAnsi="Georgia"/>
+        </w:rPr>
+      </w:pPr>
+      <w:r>
+        <w:rPr>
+          <w:rFonts w:ascii="Georgia" w:hAnsi="Georgia"/>
+        </w:rPr>
+        <w:t xml:space="preserve">In </w:t>
+      </w:r>
+      <w:r>
+        <w:rPr>
+          <w:rFonts w:ascii="Georgia" w:hAnsi="Georgia"/>
+        </w:rPr>
+        <w:t>both</w:t>
+      </w:r>
+      <w:r>
+        <w:rPr>
+          <w:rFonts w:ascii="Georgia" w:hAnsi="Georgia"/>
+        </w:rPr>
+        <w:t xml:space="preserve"> cases, however, this can be treated practically. That is</w:t>
+      </w:r>
+      <w:r>
+        <w:rPr>
+          <w:rFonts w:ascii="Georgia" w:hAnsi="Georgia"/>
+        </w:rPr>
+        <w:t>,</w:t>
+      </w:r>
+      <w:r>
+        <w:rPr>
+          <w:rFonts w:ascii="Georgia" w:hAnsi="Georgia"/>
+        </w:rPr>
+        <w:t xml:space="preserve"> we can look for and exclude these kinds of deviations </w:t>
+      </w:r>
+      <w:r>
+        <w:rPr>
+          <w:rFonts w:ascii="Georgia" w:hAnsi="Georgia"/>
+        </w:rPr>
+        <w:t>as</w:t>
+      </w:r>
+      <w:r>
+        <w:rPr>
+          <w:rFonts w:ascii="Georgia" w:hAnsi="Georgia"/>
+        </w:rPr>
+        <w:t xml:space="preserve"> they occur as opposed to attempting to </w:t>
+      </w:r>
+      <w:r>
+        <w:rPr>
+          <w:rFonts w:ascii="Georgia" w:hAnsi="Georgia"/>
+        </w:rPr>
+        <w:t>quantify</w:t>
+      </w:r>
+      <w:r>
+        <w:rPr>
+          <w:rFonts w:ascii="Georgia" w:hAnsi="Georgia"/>
+        </w:rPr>
+        <w:t xml:space="preserve"> </w:t>
+      </w:r>
+      <w:r>
+        <w:rPr>
+          <w:rFonts w:ascii="Georgia" w:hAnsi="Georgia"/>
+        </w:rPr>
+        <w:t>every possible version in advance</w:t>
+      </w:r>
+      <w:r>
+        <w:rPr>
+          <w:rFonts w:ascii="Georgia" w:hAnsi="Georgia"/>
+        </w:rPr>
+        <w:t>. If the sensors and configuration</w:t>
+      </w:r>
+      <w:r>
+        <w:rPr>
+          <w:rFonts w:ascii="Georgia" w:hAnsi="Georgia"/>
+        </w:rPr>
+        <w:t>s</w:t>
+      </w:r>
+      <w:r>
+        <w:rPr>
+          <w:rFonts w:ascii="Georgia" w:hAnsi="Georgia"/>
+        </w:rPr>
+        <w:t xml:space="preserve"> chosen </w:t>
+      </w:r>
+      <w:proofErr w:type="gramStart"/>
+      <w:r>
+        <w:rPr>
+          <w:rFonts w:ascii="Georgia" w:hAnsi="Georgia"/>
+        </w:rPr>
+        <w:t>do</w:t>
+      </w:r>
+      <w:proofErr w:type="gramEnd"/>
+      <w:r>
+        <w:rPr>
+          <w:rFonts w:ascii="Georgia" w:hAnsi="Georgia"/>
+        </w:rPr>
+        <w:t xml:space="preserve"> not lead to appreciable </w:t>
+      </w:r>
+      <w:r>
+        <w:rPr>
+          <w:rFonts w:ascii="Georgia" w:hAnsi="Georgia"/>
+        </w:rPr>
+        <w:t>issues</w:t>
+      </w:r>
+      <w:r>
+        <w:rPr>
+          <w:rFonts w:ascii="Georgia" w:hAnsi="Georgia"/>
+        </w:rPr>
+        <w:t xml:space="preserve">, there </w:t>
+      </w:r>
+      <w:r>
+        <w:rPr>
+          <w:rFonts w:ascii="Georgia" w:hAnsi="Georgia"/>
+        </w:rPr>
+        <w:t>is no need to address them</w:t>
+      </w:r>
+      <w:r>
+        <w:rPr>
+          <w:rFonts w:ascii="Georgia" w:hAnsi="Georgia"/>
+        </w:rPr>
+        <w:t xml:space="preserve">. </w:t>
+      </w:r>
+    </w:p>
+    <w:p>
+      <w:pPr>
+        <w:rPr>
+          <w:rFonts w:ascii="Georgia" w:hAnsi="Georgia"/>
+        </w:rPr>
+      </w:pPr>
+      <w:r>
+        <w:rPr>
+          <w:rFonts w:ascii="Georgia" w:hAnsi="Georgia"/>
+        </w:rPr>
+        <w:t>In summary for each of the 3 chosen behaviors we will select a reasonable starting configuration, run sensor fusion, inspect the tolerance</w:t>
+      </w:r>
+      <w:r>
+        <w:rPr>
+          <w:rFonts w:ascii="Georgia" w:hAnsi="Georgia"/>
+        </w:rPr>
+        <w:t xml:space="preserve">, look for lag or drift deviations that are unimportant to us, and then if tolerance is not met use the iterative approach described above to search for sensors and configuration that will be within tolerance. </w:t>
+      </w:r>
+    </w:p>
+    <w:p>
+      <w:pPr>
+        <w:rPr>
+          <w:rFonts w:ascii="Georgia" w:hAnsi="Georgia"/>
+        </w:rPr>
+      </w:pPr>
+      <w:r>
+        <w:rPr>
+          <w:rFonts w:ascii="Georgia" w:hAnsi="Georgia"/>
+        </w:rPr>
+        <w:t xml:space="preserve">Once feasible solutions are found for the single </w:t>
+      </w:r>
+      <w:r>
+        <w:rPr>
+          <w:rFonts w:ascii="Georgia" w:hAnsi="Georgia"/>
+        </w:rPr>
+        <w:t>cases,</w:t>
+      </w:r>
+      <w:r>
+        <w:rPr>
+          <w:rFonts w:ascii="Georgia" w:hAnsi="Georgia"/>
+        </w:rPr>
+        <w:t xml:space="preserve"> we will then repeat the analysis over all NM simulations and identify the worst offenders. These will then become candidates for the same iterative process described above. This process will repeat until we have </w:t>
+      </w:r>
+      <w:r>
+        <w:rPr>
+          <w:rFonts w:ascii="Georgia" w:hAnsi="Georgia"/>
+        </w:rPr>
+        <w:t xml:space="preserve">a solution that can handle all NM simulations. </w:t>
+      </w:r>
+    </w:p>
+    <w:p>
+      <w:pPr>
+        <w:rPr>
+          <w:rFonts w:ascii="Georgia" w:hAnsi="Georgia"/>
+        </w:rPr>
+      </w:pPr>
+      <w:r>
+        <w:rPr>
+          <w:rFonts w:ascii="Georgia" w:hAnsi="Georgia"/>
+        </w:rPr>
+        <w:t xml:space="preserve">Using these specifications as a starting point we will then repeat this entire process </w:t>
+      </w:r>
+      <w:r>
+        <w:rPr>
+          <w:rFonts w:ascii="Georgia" w:hAnsi="Georgia"/>
+        </w:rPr>
+        <w:t>for</w:t>
+      </w:r>
+      <w:r>
+        <w:rPr>
+          <w:rFonts w:ascii="Georgia" w:hAnsi="Georgia"/>
+        </w:rPr>
+        <w:t xml:space="preserve"> each of the other representative behaviors for each of the species. It is important to note that we will be looking for 3 specifications – one for each representative </w:t>
+      </w:r>
+      <w:r>
+        <w:rPr>
+          <w:rFonts w:ascii="Georgia" w:hAnsi="Georgia"/>
+        </w:rPr>
+        <w:t>animal</w:t>
+      </w:r>
+      <w:r>
+        <w:rPr>
+          <w:rFonts w:ascii="Georgia" w:hAnsi="Georgia"/>
+        </w:rPr>
+        <w:t xml:space="preserve"> – as opposed to a specification per behavior. </w:t>
+      </w:r>
+    </w:p>
+    <w:p>
+      <w:pPr>
+        <w:rPr>
+          <w:rFonts w:ascii="Georgia" w:hAnsi="Georgia"/>
+        </w:rPr>
+      </w:pPr>
+      <w:r>
+        <w:rPr>
+          <w:rFonts w:ascii="Georgia" w:hAnsi="Georgia"/>
+        </w:rPr>
+        <w:t xml:space="preserve">To ultimately represent the solutions found we will provide </w:t>
+      </w:r>
+      <w:r>
+        <w:rPr>
+          <w:rFonts w:ascii="Georgia" w:hAnsi="Georgia"/>
+        </w:rPr>
+        <w:t>visuals</w:t>
+      </w:r>
+      <w:r>
+        <w:rPr>
+          <w:rFonts w:ascii="Georgia" w:hAnsi="Georgia"/>
+        </w:rPr>
+        <w:t xml:space="preserve"> showing </w:t>
+      </w:r>
+      <w:r>
+        <w:rPr>
+          <w:rFonts w:ascii="Georgia" w:hAnsi="Georgia"/>
+        </w:rPr>
+        <w:t>for each</w:t>
+      </w:r>
+      <w:r>
+        <w:rPr>
+          <w:rFonts w:ascii="Georgia" w:hAnsi="Georgia"/>
+        </w:rPr>
+        <w:t xml:space="preserve"> animal and behavior the distribution of deviations through time and across the NM samples as compared to the tolerance we have set. </w:t>
+      </w:r>
+    </w:p>
+    <w:p>
+      <w:pPr>
+        <w:rPr>
+          <w:rFonts w:ascii="Georgia" w:hAnsi="Georgia"/>
+        </w:rPr>
+      </w:pPr>
+    </w:p>
+    <w:p>
+      <w:pPr>
+        <w:rPr>
+          <w:rFonts w:ascii="Georgia" w:hAnsi="Georgia"/>
+          <w:i/>
+          <w:iCs/>
+          <w:sz w:val="28"/>
+          <w:szCs w:val="28"/>
+        </w:rPr>
+      </w:pPr>
+    </w:p>
+    <w:p>
+      <w:pPr>
+        <w:rPr>
+          <w:rFonts w:ascii="Georgia" w:hAnsi="Georgia"/>
+          <w:i/>
+          <w:iCs/>
+          <w:sz w:val="28"/>
+          <w:szCs w:val="28"/>
+        </w:rPr>
+      </w:pPr>
+    </w:p>
+    <w:p>
+      <w:pPr>
+        <w:rPr>
+          <w:rFonts w:ascii="Georgia" w:hAnsi="Georgia"/>
+          <w:i/>
+          <w:iCs/>
+          <w:sz w:val="28"/>
+          <w:szCs w:val="28"/>
+        </w:rPr>
+      </w:pPr>
+      <w:r>
+        <w:rPr>
+          <w:rFonts w:ascii="Georgia" w:hAnsi="Georgia"/>
+          <w:i/>
+          <w:iCs/>
+          <w:sz w:val="28"/>
+          <w:szCs w:val="28"/>
+        </w:rPr>
+        <w:lastRenderedPageBreak/>
+        <w:t>Case Studies: Sensitivity</w:t>
+      </w:r>
+    </w:p>
+    <w:p>
+      <w:pPr>
+        <w:rPr>
+          <w:rFonts w:ascii="Georgia" w:hAnsi="Georgia"/>
+        </w:rPr>
+      </w:pPr>
+      <w:r>
+        <w:rPr>
+          <w:rFonts w:ascii="Georgia" w:hAnsi="Georgia"/>
+        </w:rPr>
+        <w:t xml:space="preserve">With nominal solutions found for each animal we will proceed with understanding how these solutions change as the tag deviations change. This corresponds to changes in how tags are attached, expected turbulence, etc. </w:t>
+      </w:r>
+      <w:r>
+        <w:rPr>
+          <w:rFonts w:ascii="Georgia" w:hAnsi="Georgia"/>
+        </w:rPr>
+        <w:t>Given</w:t>
+      </w:r>
+      <w:r>
+        <w:rPr>
+          <w:rFonts w:ascii="Georgia" w:hAnsi="Georgia"/>
+        </w:rPr>
+        <w:t xml:space="preserve"> that different tag designs can exacerbate or mitigate these issues</w:t>
+      </w:r>
+      <w:r>
+        <w:rPr>
+          <w:rFonts w:ascii="Georgia" w:hAnsi="Georgia"/>
+        </w:rPr>
+        <w:t>,</w:t>
+      </w:r>
+      <w:r>
+        <w:rPr>
+          <w:rFonts w:ascii="Georgia" w:hAnsi="Georgia"/>
+        </w:rPr>
+        <w:t xml:space="preserve"> we want to understand the relationships between sensor design and these issues </w:t>
+      </w:r>
+      <w:r>
+        <w:rPr>
+          <w:rFonts w:ascii="Georgia" w:hAnsi="Georgia"/>
+        </w:rPr>
+        <w:t>to inform design</w:t>
+      </w:r>
+      <w:r>
+        <w:rPr>
+          <w:rFonts w:ascii="Georgia" w:hAnsi="Georgia"/>
+        </w:rPr>
+        <w:t xml:space="preserve">. </w:t>
+      </w:r>
+      <w:r>
+        <w:rPr>
+          <w:rFonts w:ascii="Georgia" w:hAnsi="Georgia"/>
+        </w:rPr>
+        <w:t xml:space="preserve">Simply presenting the “perfect” overall solution would not provide tag designers with the information required to make trades between better sensors and better tag designs. </w:t>
+      </w:r>
+    </w:p>
+    <w:p>
+      <w:pPr>
+        <w:rPr>
+          <w:rFonts w:ascii="Georgia" w:hAnsi="Georgia"/>
+        </w:rPr>
+      </w:pPr>
+      <w:r>
+        <w:rPr>
+          <w:rFonts w:ascii="Georgia" w:hAnsi="Georgia"/>
+        </w:rPr>
+        <w:t>As such, f</w:t>
+      </w:r>
+      <w:r>
+        <w:rPr>
+          <w:rFonts w:ascii="Georgia" w:hAnsi="Georgia"/>
+        </w:rPr>
+        <w:t xml:space="preserve">or each kind of </w:t>
+      </w:r>
+      <w:r>
+        <w:rPr>
+          <w:rFonts w:ascii="Georgia" w:hAnsi="Georgia"/>
+        </w:rPr>
+        <w:t>deviation,</w:t>
+      </w:r>
+      <w:r>
+        <w:rPr>
+          <w:rFonts w:ascii="Georgia" w:hAnsi="Georgia"/>
+        </w:rPr>
+        <w:t xml:space="preserve"> we will create a series of NM samples as above but across a range of the deviation. </w:t>
+      </w:r>
+      <w:r>
+        <w:rPr>
+          <w:rFonts w:ascii="Georgia" w:hAnsi="Georgia"/>
+        </w:rPr>
+        <w:t xml:space="preserve">We will then repeat the same process described above to come up with a range of solutions as the deviation gets more severe. </w:t>
+      </w:r>
+      <w:r>
+        <w:rPr>
+          <w:rFonts w:ascii="Georgia" w:hAnsi="Georgia"/>
+        </w:rPr>
+        <w:t xml:space="preserve">These will then be translated into design curves that indicate how the sensors and configurations must be changed to </w:t>
+      </w:r>
+      <w:r>
+        <w:rPr>
+          <w:rFonts w:ascii="Georgia" w:hAnsi="Georgia"/>
+        </w:rPr>
+        <w:t>accommodate</w:t>
+      </w:r>
+      <w:r>
+        <w:rPr>
+          <w:rFonts w:ascii="Georgia" w:hAnsi="Georgia"/>
+        </w:rPr>
+        <w:t xml:space="preserve"> increasing deviation. </w:t>
       </w:r>
       <w:r>
         <w:rPr>
@@ -2250,6 +3519,61 @@
         <w:rPr>
           <w:rFonts w:ascii="Georgia" w:hAnsi="Georgia"/>
         </w:rPr>
+        <w:t xml:space="preserve">Hiscocks S, Barr J, </w:t>
+      </w:r>
+      <w:proofErr w:type="spellStart"/>
+      <w:r>
+        <w:rPr>
+          <w:rFonts w:ascii="Georgia" w:hAnsi="Georgia"/>
+        </w:rPr>
+        <w:t>Perree</w:t>
+      </w:r>
+      <w:proofErr w:type="spellEnd"/>
+      <w:r>
+        <w:rPr>
+          <w:rFonts w:ascii="Georgia" w:hAnsi="Georgia"/>
+        </w:rPr>
+        <w:t xml:space="preserve"> N, Wright J, Pritchett H, </w:t>
+      </w:r>
+      <w:proofErr w:type="spellStart"/>
+      <w:r>
+        <w:rPr>
+          <w:rFonts w:ascii="Georgia" w:hAnsi="Georgia"/>
+        </w:rPr>
+        <w:t>Rosoman</w:t>
+      </w:r>
+      <w:proofErr w:type="spellEnd"/>
+      <w:r>
+        <w:rPr>
+          <w:rFonts w:ascii="Georgia" w:hAnsi="Georgia"/>
+        </w:rPr>
+        <w:t xml:space="preserve"> O, Harris M, Gorman R, Pike S, Carniglia P, Vladimirov L, Oakes BD. Stone Soup: no longer just an </w:t>
+      </w:r>
+      <w:proofErr w:type="spellStart"/>
+      <w:r>
+        <w:rPr>
+          <w:rFonts w:ascii="Georgia" w:hAnsi="Georgia"/>
+        </w:rPr>
+        <w:t>appetiser</w:t>
+      </w:r>
+      <w:proofErr w:type="spellEnd"/>
+      <w:r>
+        <w:rPr>
+          <w:rFonts w:ascii="Georgia" w:hAnsi="Georgia"/>
+        </w:rPr>
+        <w:t>. In: 2023 26th International Conference on Information Fusion (FUSION); 2023 Jun 28–Jul 1; Charleston (SC). Piscataway (NJ): IEEE; 2023. p. 1–8. doi:10.23919/FUSION52260.2023.10224185.</w:t>
+      </w:r>
+    </w:p>
+    <w:p>
+      <w:pPr>
+        <w:rPr>
+          <w:rFonts w:ascii="Georgia" w:hAnsi="Georgia"/>
+        </w:rPr>
+      </w:pPr>
+      <w:r>
+        <w:rPr>
+          <w:rFonts w:ascii="Georgia" w:hAnsi="Georgia"/>
+        </w:rPr>
         <w:t xml:space="preserve">Hueter, R. E., Tyminski, J. P., &amp; De La Parra, R. (2013). Horizontal Movements, Migration Patterns, and Population Structure of Whale Sharks in the Gulf of Mexico and Northwestern Caribbean Sea. </w:t>
       </w:r>
       <w:proofErr w:type="spellStart"/>
@@ -2291,6 +3615,75 @@
         <w:rPr>
           <w:rFonts w:ascii="Georgia" w:hAnsi="Georgia"/>
         </w:rPr>
+        <w:t xml:space="preserve">Linderman SW, Chang P, Harper-Donnelly G, Kara A, Li X, Duran-Martin G, Murphy K. </w:t>
+      </w:r>
+      <w:proofErr w:type="spellStart"/>
+      <w:r>
+        <w:rPr>
+          <w:rFonts w:ascii="Georgia" w:hAnsi="Georgia"/>
+        </w:rPr>
+        <w:t>Dynamax</w:t>
+      </w:r>
+      <w:proofErr w:type="spellEnd"/>
+      <w:r>
+        <w:rPr>
+          <w:rFonts w:ascii="Georgia" w:hAnsi="Georgia"/>
+        </w:rPr>
+        <w:t xml:space="preserve">: </w:t>
+      </w:r>
+      <w:proofErr w:type="gramStart"/>
+      <w:r>
+        <w:rPr>
+          <w:rFonts w:ascii="Georgia" w:hAnsi="Georgia"/>
+        </w:rPr>
+        <w:t>a</w:t>
+      </w:r>
+      <w:proofErr w:type="gramEnd"/>
+      <w:r>
+        <w:rPr>
+          <w:rFonts w:ascii="Georgia" w:hAnsi="Georgia"/>
+        </w:rPr>
+        <w:t xml:space="preserve"> Python package for probabilistic state space modeling with JAX. J </w:t>
+      </w:r>
+      <w:proofErr w:type="gramStart"/>
+      <w:r>
+        <w:rPr>
+          <w:rFonts w:ascii="Georgia" w:hAnsi="Georgia"/>
+        </w:rPr>
+        <w:t>Open Source</w:t>
+      </w:r>
+      <w:proofErr w:type="gramEnd"/>
+      <w:r>
+        <w:rPr>
+          <w:rFonts w:ascii="Georgia" w:hAnsi="Georgia"/>
+        </w:rPr>
+        <w:t xml:space="preserve"> </w:t>
+      </w:r>
+      <w:proofErr w:type="spellStart"/>
+      <w:r>
+        <w:rPr>
+          <w:rFonts w:ascii="Georgia" w:hAnsi="Georgia"/>
+        </w:rPr>
+        <w:t>Softw</w:t>
+      </w:r>
+      <w:proofErr w:type="spellEnd"/>
+      <w:r>
+        <w:rPr>
+          <w:rFonts w:ascii="Georgia" w:hAnsi="Georgia"/>
+        </w:rPr>
+        <w:t>. 2025;10(108):7069. doi:10.21105/joss.07069.</w:t>
+      </w:r>
+    </w:p>
+    <w:p>
+      <w:pPr>
+        <w:rPr>
+          <w:rFonts w:ascii="Georgia" w:hAnsi="Georgia"/>
+        </w:rPr>
+      </w:pPr>
+      <w:r>
+        <w:rPr>
+          <w:rFonts w:ascii="Georgia" w:hAnsi="Georgia"/>
+        </w:rPr>
         <w:t>National Oceanic and Atmospheric Administration, Department of Commerce. Essential Fish Habitat (EFH). Title 50 C.F.R. § 600, Subpart J. 2026</w:t>
       </w:r>
     </w:p>
@@ -2404,6 +3797,7 @@
         <w:rPr>
           <w:rFonts w:ascii="Georgia" w:hAnsi="Georgia"/>
         </w:rPr>
+        <w:lastRenderedPageBreak/>
         <w:t>Similä T, Ugarte F. Surface and underwater observations of cooperatively feeding killer whales in northern Norway. Can J Zool. 1993 Aug 1;71(8):1494–9. doi:10.1139/z93-210</w:t>
       </w:r>
     </w:p>
@@ -4491,7 +5885,6 @@
   <w:style w:type="character" w:default="1" w:styleId="DefaultParagraphFont">
     <w:name w:val="Default Paragraph Font"/>
     <w:uiPriority w:val="1"/>
-    <w:semiHidden/>
     <w:unhideWhenUsed/>
   </w:style>
   <w:style w:type="table" w:default="1" w:styleId="TableNormal">

</xml_diff>